<commit_message>
docs: reorganizar documentacion y evidencias de PracticaLink
</commit_message>
<xml_diff>
--- a/Fase 2/Evidencias Proyecto/Documento 05 - Documento de Diseño.docx
+++ b/Fase 2/Evidencias Proyecto/Documento 05 - Documento de Diseño.docx
@@ -368,7 +368,7 @@
                 <w:vertAlign w:val="baseline"/>
                 <w:rtl w:val="0"/>
               </w:rPr>
-              <w:t xml:space="preserve">01</w:t>
+              <w:t xml:space="preserve">02</w:t>
             </w:r>
           </w:p>
         </w:tc>
@@ -433,7 +433,7 @@
                 <w:vertAlign w:val="baseline"/>
                 <w:rtl w:val="0"/>
               </w:rPr>
-              <w:t xml:space="preserve">2 de octubre de 2026</w:t>
+              <w:t xml:space="preserve">16 de octubre de 2026</w:t>
             </w:r>
           </w:p>
         </w:tc>
@@ -1817,6 +1817,120 @@
         </w:p>
         <w:p>
           <w:pPr>
+            <w:keepNext w:val="0"/>
+            <w:keepLines w:val="0"/>
+            <w:pageBreakBefore w:val="0"/>
+            <w:widowControl w:val="1"/>
+            <w:pBdr>
+              <w:top w:space="0" w:sz="0" w:val="nil"/>
+              <w:left w:space="0" w:sz="0" w:val="nil"/>
+              <w:bottom w:space="0" w:sz="0" w:val="nil"/>
+              <w:right w:space="0" w:sz="0" w:val="nil"/>
+              <w:between w:space="0" w:sz="0" w:val="nil"/>
+            </w:pBdr>
+            <w:shd w:fill="auto" w:val="clear"/>
+            <w:tabs>
+              <w:tab w:val="left" w:leader="none" w:pos="1320"/>
+              <w:tab w:val="right" w:leader="none" w:pos="8828"/>
+            </w:tabs>
+            <w:spacing w:after="0" w:before="0" w:line="276" w:lineRule="auto"/>
+            <w:ind w:left="440" w:right="0" w:firstLine="0"/>
+            <w:jc w:val="left"/>
+            <w:rPr>
+              <w:rFonts w:ascii="Calibri" w:cs="Calibri" w:eastAsia="Calibri" w:hAnsi="Calibri"/>
+              <w:b w:val="0"/>
+              <w:bCs w:val="0"/>
+              <w:i w:val="0"/>
+              <w:iCs w:val="0"/>
+              <w:smallCaps w:val="0"/>
+              <w:strike w:val="0"/>
+              <w:color w:val="000000"/>
+              <w:sz w:val="24"/>
+              <w:szCs w:val="24"/>
+              <w:u w:val="none"/>
+              <w:shd w:fill="auto" w:val="clear"/>
+              <w:vertAlign w:val="baseline"/>
+            </w:rPr>
+          </w:pPr>
+          <w:hyperlink w:anchor="_heading=h.despliegue432">
+            <w:r>
+              <w:rPr>
+                <w:rFonts w:ascii="Calibri" w:cs="Calibri" w:eastAsia="Calibri" w:hAnsi="Calibri"/>
+                <w:b w:val="0"/>
+                <w:bCs w:val="0"/>
+                <w:i w:val="1"/>
+                <w:iCs w:val="1"/>
+                <w:smallCaps w:val="0"/>
+                <w:strike w:val="0"/>
+                <w:color w:val="000000"/>
+                <w:sz w:val="20"/>
+                <w:szCs w:val="20"/>
+                <w:u w:val="none"/>
+                <w:shd w:fill="auto" w:val="clear"/>
+                <w:vertAlign w:val="baseline"/>
+                <w:rtl w:val="0"/>
+              </w:rPr>
+              <w:t xml:space="preserve">4.3.2</w:t>
+            </w:r>
+          </w:hyperlink>
+          <w:hyperlink w:anchor="_heading=h.despliegue432">
+            <w:r>
+              <w:rPr>
+                <w:rFonts w:ascii="Calibri" w:cs="Calibri" w:eastAsia="Calibri" w:hAnsi="Calibri"/>
+                <w:b w:val="0"/>
+                <w:bCs w:val="0"/>
+                <w:i w:val="0"/>
+                <w:iCs w:val="0"/>
+                <w:smallCaps w:val="0"/>
+                <w:strike w:val="0"/>
+                <w:color w:val="000000"/>
+                <w:sz w:val="24"/>
+                <w:szCs w:val="24"/>
+                <w:u w:val="none"/>
+                <w:shd w:fill="auto" w:val="clear"/>
+                <w:vertAlign w:val="baseline"/>
+                <w:rtl w:val="0"/>
+              </w:rPr>
+              <w:tab/>
+            </w:r>
+          </w:hyperlink>
+          <w:r>
+            <w:fldChar w:fldCharType="begin"/>
+            <w:instrText xml:space="preserve"> PAGEREF _heading=h.despliegue432 \h </w:instrText>
+            <w:fldChar w:fldCharType="separate"/>
+          </w:r>
+          <w:r>
+            <w:rPr>
+              <w:rFonts w:ascii="Calibri" w:cs="Calibri" w:eastAsia="Calibri" w:hAnsi="Calibri"/>
+              <w:b w:val="0"/>
+              <w:bCs w:val="0"/>
+              <w:i w:val="1"/>
+              <w:iCs w:val="1"/>
+              <w:smallCaps w:val="0"/>
+              <w:strike w:val="0"/>
+              <w:color w:val="000000"/>
+              <w:sz w:val="20"/>
+              <w:szCs w:val="20"/>
+              <w:u w:val="none"/>
+              <w:shd w:fill="auto" w:val="clear"/>
+              <w:vertAlign w:val="baseline"/>
+              <w:rtl w:val="0"/>
+            </w:rPr>
+            <w:t xml:space="preserve">Diagrama de Despliegue</w:t>
+            <w:tab/>
+            <w:t xml:space="preserve">13</w:t>
+          </w:r>
+          <w:r>
+            <w:fldChar w:fldCharType="end"/>
+          </w:r>
+          <w:r>
+            <w:rPr>
+              <w:rtl w:val="0"/>
+            </w:rPr>
+          </w:r>
+        </w:p>
+        <w:p>
+          <w:pPr>
             <w:jc w:val="both"/>
             <w:rPr/>
           </w:pPr>
@@ -2220,6 +2334,107 @@
           </w:p>
         </w:tc>
       </w:tr>
+      <w:tr>
+        <w:trPr>
+          <w:cantSplit w:val="0"/>
+          <w:trHeight w:val="1134" w:hRule="atLeast"/>
+          <w:tblHeader w:val="0"/>
+        </w:trPr>
+        <w:tc>
+          <w:tcPr>
+            <w:vAlign w:val="center"/>
+          </w:tcPr>
+          <w:p>
+            <w:pPr>
+              <w:jc w:val="both"/>
+              <w:rPr>
+                <w:rFonts w:ascii="Calibri" w:cs="Calibri" w:eastAsia="Calibri" w:hAnsi="Calibri"/>
+              </w:rPr>
+            </w:pPr>
+            <w:r>
+              <w:rPr>
+                <w:rFonts w:ascii="Calibri" w:cs="Calibri" w:eastAsia="Calibri" w:hAnsi="Calibri"/>
+                <w:rtl w:val="0"/>
+              </w:rPr>
+              <w:t xml:space="preserve">16-10-2026</w:t>
+            </w:r>
+          </w:p>
+        </w:tc>
+        <w:tc>
+          <w:tcPr>
+            <w:vAlign w:val="center"/>
+          </w:tcPr>
+          <w:p>
+            <w:pPr>
+              <w:jc w:val="both"/>
+              <w:rPr>
+                <w:rFonts w:ascii="Calibri" w:cs="Calibri" w:eastAsia="Calibri" w:hAnsi="Calibri"/>
+              </w:rPr>
+            </w:pPr>
+            <w:r>
+              <w:rPr>
+                <w:rFonts w:ascii="Calibri" w:cs="Calibri" w:eastAsia="Calibri" w:hAnsi="Calibri"/>
+                <w:rtl w:val="0"/>
+              </w:rPr>
+              <w:t xml:space="preserve">02</w:t>
+            </w:r>
+          </w:p>
+        </w:tc>
+        <w:tc>
+          <w:tcPr>
+            <w:vAlign w:val="center"/>
+          </w:tcPr>
+          <w:p>
+            <w:pPr>
+              <w:jc w:val="both"/>
+              <w:rPr>
+                <w:rFonts w:ascii="Calibri" w:cs="Calibri" w:eastAsia="Calibri" w:hAnsi="Calibri"/>
+              </w:rPr>
+            </w:pPr>
+            <w:r>
+              <w:rPr>
+                <w:rFonts w:ascii="Calibri" w:cs="Calibri" w:eastAsia="Calibri" w:hAnsi="Calibri"/>
+                <w:rtl w:val="0"/>
+              </w:rPr>
+              <w:t xml:space="preserve">Equipo PracticaLink</w:t>
+            </w:r>
+          </w:p>
+        </w:tc>
+        <w:tc>
+          <w:tcPr>
+            <w:vAlign w:val="center"/>
+          </w:tcPr>
+          <w:p>
+            <w:pPr>
+              <w:spacing w:line="276" w:lineRule="auto"/>
+              <w:jc w:val="both"/>
+              <w:rPr>
+                <w:rFonts w:ascii="Calibri" w:cs="Calibri" w:eastAsia="Calibri" w:hAnsi="Calibri"/>
+              </w:rPr>
+            </w:pPr>
+            <w:r>
+              <w:rPr>
+                <w:rFonts w:ascii="Calibri" w:cs="Calibri" w:eastAsia="Calibri" w:hAnsi="Calibri"/>
+                <w:rtl w:val="0"/>
+              </w:rPr>
+              <w:t xml:space="preserve">Casos de uso por incremento de EP01 a EP04 (hasta la semana 9), tabla de trazabilidad actualizada, modelo E-R completo (15 tablas del esquema) y diagrama de despliegue del entorno QA (Render, Supabase y aplicación Android).</w:t>
+            </w:r>
+          </w:p>
+          <w:p>
+            <w:pPr>
+              <w:jc w:val="both"/>
+              <w:rPr>
+                <w:rFonts w:ascii="Calibri" w:cs="Calibri" w:eastAsia="Calibri" w:hAnsi="Calibri"/>
+              </w:rPr>
+            </w:pPr>
+            <w:r>
+              <w:rPr>
+                <w:rtl w:val="0"/>
+              </w:rPr>
+            </w:r>
+          </w:p>
+        </w:tc>
+      </w:tr>
     </w:tbl>
     <w:p>
       <w:pPr>
@@ -2583,7 +2798,7 @@
         <w:rPr>
           <w:rtl w:val="0"/>
         </w:rPr>
-        <w:t xml:space="preserve">La sección 4 contiene el diseño de las épicas EP01 (acceso y gestión de usuarios), EP02 (registro de práctica profesional) y EP03 (revisión y validación de prácticas), implementadas en el Release 1.1. Sus diagramas ya fueron verificados contra el repositorio del proyecto (capstone-gestion-practicas/gestion-practicas-profesionales) y el script de base de datos scripts/BD/schema.sql. La sección 5 contiene el diseño de las épicas EP04 a EP07, que guiará los próximos sprints.</w:t>
+        <w:t xml:space="preserve">La sección 4 contiene el diseño de las épicas EP01 (acceso y gestión de usuarios), EP02 (registro de práctica profesional) y EP03 (revisión y validación de prácticas), implementadas en el Release 1.1. Sus diagramas ya fueron verificados contra el repositorio del proyecto (capstone-gestion-practicas/gestion-practicas-profesionales) y el script de base de datos scripts/BD/schema.sql. El modelo E-R y el diagrama de despliegue se presentan completos, ya que el esquema de base de datos y la infraestructura son comunes a todas las épicas, incluidas EP04 a EP07, que se implementarán en los próximos sprints. El diagrama de casos de uso abarca las épicas EP01 a EP04, planificadas en la Carta Gantt hasta la semana 9.</w:t>
       </w:r>
     </w:p>
     <w:p>
@@ -2596,7 +2811,7 @@
         <w:rPr>
           <w:rtl w:val="0"/>
         </w:rPr>
-        <w:t xml:space="preserve">La siguiente tabla relaciona cada historia de usuario de EP01 a EP03 con los elementos de diseño que la implementan:</w:t>
+        <w:t xml:space="preserve">La siguiente tabla relaciona cada historia de usuario de EP01 a EP04, y las funcionalidades de apoyo que aparecen en los casos de uso, con los elementos de diseño que las implementan. Las filas se agrupan por épica en el orden de la Carta Gantt. Las filas de EP04, en cursiva, corresponden al diseño planificado para las semanas 8 y 9; los nombres de los endpoints, componentes y funciones nuevos podrán ajustarse durante su implementación.</w:t>
       </w:r>
     </w:p>
     <w:tbl>
@@ -2751,105 +2966,29 @@
       <w:tr>
         <w:trPr>
           <w:cantSplit w:val="1"/>
-          <w:tblHeader w:val="0"/>
         </w:trPr>
         <w:tc>
           <w:tcPr>
+            <w:gridSpan w:val="4"/>
+            <w:shd w:fill="DCE6F2" w:val="clear"/>
             <w:vAlign w:val="center"/>
           </w:tcPr>
           <w:p>
             <w:pPr>
+              <w:keepNext w:val="1"/>
               <w:spacing w:after="30" w:before="30" w:lineRule="auto"/>
               <w:rPr/>
             </w:pPr>
             <w:r>
               <w:rPr>
                 <w:rFonts w:ascii="Calibri" w:cs="Calibri" w:eastAsia="Calibri" w:hAnsi="Calibri"/>
+                <w:b w:val="1"/>
+                <w:bCs w:val="1"/>
+                <w:color w:val="2F5597"/>
                 <w:sz w:val="18"/>
                 <w:szCs w:val="18"/>
-                <w:rtl w:val="0"/>
-              </w:rPr>
-              <w:t xml:space="preserve">HU01.1 Iniciar sesión</w:t>
-            </w:r>
-            <w:r>
-              <w:rPr>
-                <w:rtl w:val="0"/>
-              </w:rPr>
-            </w:r>
-          </w:p>
-        </w:tc>
-        <w:tc>
-          <w:tcPr>
-            <w:vAlign w:val="center"/>
-          </w:tcPr>
-          <w:p>
-            <w:pPr>
-              <w:spacing w:after="30" w:before="30" w:lineRule="auto"/>
-              <w:rPr/>
-            </w:pPr>
-            <w:r>
-              <w:rPr>
-                <w:rFonts w:ascii="Calibri" w:cs="Calibri" w:eastAsia="Calibri" w:hAnsi="Calibri"/>
-                <w:sz w:val="18"/>
-                <w:szCs w:val="18"/>
-                <w:rtl w:val="0"/>
-              </w:rPr>
-              <w:t xml:space="preserve">Login · AuthService</w:t>
-            </w:r>
-            <w:r>
-              <w:rPr>
-                <w:rtl w:val="0"/>
-              </w:rPr>
-            </w:r>
-          </w:p>
-        </w:tc>
-        <w:tc>
-          <w:tcPr>
-            <w:vAlign w:val="center"/>
-          </w:tcPr>
-          <w:p>
-            <w:pPr>
-              <w:spacing w:after="30" w:before="30" w:lineRule="auto"/>
-              <w:rPr/>
-            </w:pPr>
-            <w:r>
-              <w:rPr>
-                <w:rFonts w:ascii="Calibri" w:cs="Calibri" w:eastAsia="Calibri" w:hAnsi="Calibri"/>
-                <w:sz w:val="18"/>
-                <w:szCs w:val="18"/>
-                <w:rtl w:val="0"/>
-              </w:rPr>
-              <w:t xml:space="preserve">POST /auth/login</w:t>
-            </w:r>
-            <w:r>
-              <w:rPr>
-                <w:rtl w:val="0"/>
-              </w:rPr>
-            </w:r>
-          </w:p>
-        </w:tc>
-        <w:tc>
-          <w:tcPr>
-            <w:vAlign w:val="center"/>
-          </w:tcPr>
-          <w:p>
-            <w:pPr>
-              <w:spacing w:after="30" w:before="30" w:lineRule="auto"/>
-              <w:rPr/>
-            </w:pPr>
-            <w:r>
-              <w:rPr>
-                <w:rFonts w:ascii="Calibri" w:cs="Calibri" w:eastAsia="Calibri" w:hAnsi="Calibri"/>
-                <w:sz w:val="18"/>
-                <w:szCs w:val="18"/>
-                <w:rtl w:val="0"/>
-              </w:rPr>
-              <w:t xml:space="preserve">usuario (password_hash)</w:t>
-            </w:r>
-            <w:r>
-              <w:rPr>
-                <w:rtl w:val="0"/>
-              </w:rPr>
+              </w:rPr>
+              <w:t xml:space="preserve">EP01 — Acceso y gestión de usuarios · semanas 5 y 6 · implementada (Release 1.1)</w:t>
             </w:r>
           </w:p>
         </w:tc>
@@ -2857,7 +2996,6 @@
       <w:tr>
         <w:trPr>
           <w:cantSplit w:val="1"/>
-          <w:tblHeader w:val="0"/>
         </w:trPr>
         <w:tc>
           <w:tcPr>
@@ -2873,14 +3011,8 @@
                 <w:rFonts w:ascii="Calibri" w:cs="Calibri" w:eastAsia="Calibri" w:hAnsi="Calibri"/>
                 <w:sz w:val="18"/>
                 <w:szCs w:val="18"/>
-                <w:rtl w:val="0"/>
-              </w:rPr>
-              <w:t xml:space="preserve">HU01.2 Acceder según rol</w:t>
-            </w:r>
-            <w:r>
-              <w:rPr>
-                <w:rtl w:val="0"/>
-              </w:rPr>
+              </w:rPr>
+              <w:t xml:space="preserve">HU01.1 Iniciar sesión</w:t>
             </w:r>
           </w:p>
         </w:tc>
@@ -2898,14 +3030,8 @@
                 <w:rFonts w:ascii="Calibri" w:cs="Calibri" w:eastAsia="Calibri" w:hAnsi="Calibri"/>
                 <w:sz w:val="18"/>
                 <w:szCs w:val="18"/>
-                <w:rtl w:val="0"/>
-              </w:rPr>
-              <w:t xml:space="preserve">authGuard · roleGuard · AuthStore</w:t>
-            </w:r>
-            <w:r>
-              <w:rPr>
-                <w:rtl w:val="0"/>
-              </w:rPr>
+              </w:rPr>
+              <w:t xml:space="preserve">Login · AuthService</w:t>
             </w:r>
           </w:p>
         </w:tc>
@@ -2923,14 +3049,8 @@
                 <w:rFonts w:ascii="Calibri" w:cs="Calibri" w:eastAsia="Calibri" w:hAnsi="Calibri"/>
                 <w:sz w:val="18"/>
                 <w:szCs w:val="18"/>
-                <w:rtl w:val="0"/>
-              </w:rPr>
-              <w:t xml:space="preserve">GET /auth/context · require_roles()</w:t>
-            </w:r>
-            <w:r>
-              <w:rPr>
-                <w:rtl w:val="0"/>
-              </w:rPr>
+              </w:rPr>
+              <w:t xml:space="preserve">POST /auth/login</w:t>
             </w:r>
           </w:p>
         </w:tc>
@@ -2948,14 +3068,8 @@
                 <w:rFonts w:ascii="Calibri" w:cs="Calibri" w:eastAsia="Calibri" w:hAnsi="Calibri"/>
                 <w:sz w:val="18"/>
                 <w:szCs w:val="18"/>
-                <w:rtl w:val="0"/>
-              </w:rPr>
-              <w:t xml:space="preserve">fn_contexto_usuario · usuario_rol · rol</w:t>
-            </w:r>
-            <w:r>
-              <w:rPr>
-                <w:rtl w:val="0"/>
-              </w:rPr>
+              </w:rPr>
+              <w:t xml:space="preserve">usuario (password_hash)</w:t>
             </w:r>
           </w:p>
         </w:tc>
@@ -2963,7 +3077,6 @@
       <w:tr>
         <w:trPr>
           <w:cantSplit w:val="1"/>
-          <w:tblHeader w:val="0"/>
         </w:trPr>
         <w:tc>
           <w:tcPr>
@@ -2979,14 +3092,8 @@
                 <w:rFonts w:ascii="Calibri" w:cs="Calibri" w:eastAsia="Calibri" w:hAnsi="Calibri"/>
                 <w:sz w:val="18"/>
                 <w:szCs w:val="18"/>
-                <w:rtl w:val="0"/>
-              </w:rPr>
-              <w:t xml:space="preserve">HU01.3 Cerrar sesión</w:t>
-            </w:r>
-            <w:r>
-              <w:rPr>
-                <w:rtl w:val="0"/>
-              </w:rPr>
+              </w:rPr>
+              <w:t xml:space="preserve">HU01.2 Acceder según rol</w:t>
             </w:r>
           </w:p>
         </w:tc>
@@ -3004,14 +3111,8 @@
                 <w:rFonts w:ascii="Calibri" w:cs="Calibri" w:eastAsia="Calibri" w:hAnsi="Calibri"/>
                 <w:sz w:val="18"/>
                 <w:szCs w:val="18"/>
-                <w:rtl w:val="0"/>
-              </w:rPr>
-              <w:t xml:space="preserve">Home.cerrarSesion() · AuthStore</w:t>
-            </w:r>
-            <w:r>
-              <w:rPr>
-                <w:rtl w:val="0"/>
-              </w:rPr>
+              </w:rPr>
+              <w:t xml:space="preserve">authGuard · roleGuard · AuthStore</w:t>
             </w:r>
           </w:p>
         </w:tc>
@@ -3029,14 +3130,8 @@
                 <w:rFonts w:ascii="Calibri" w:cs="Calibri" w:eastAsia="Calibri" w:hAnsi="Calibri"/>
                 <w:sz w:val="18"/>
                 <w:szCs w:val="18"/>
-                <w:rtl w:val="0"/>
-              </w:rPr>
-              <w:t xml:space="preserve">— (se elimina el JWT en el cliente)</w:t>
-            </w:r>
-            <w:r>
-              <w:rPr>
-                <w:rtl w:val="0"/>
-              </w:rPr>
+              </w:rPr>
+              <w:t xml:space="preserve">GET /auth/context · require_roles()</w:t>
             </w:r>
           </w:p>
         </w:tc>
@@ -3054,14 +3149,8 @@
                 <w:rFonts w:ascii="Calibri" w:cs="Calibri" w:eastAsia="Calibri" w:hAnsi="Calibri"/>
                 <w:sz w:val="18"/>
                 <w:szCs w:val="18"/>
-                <w:rtl w:val="0"/>
-              </w:rPr>
-              <w:t xml:space="preserve">—</w:t>
-            </w:r>
-            <w:r>
-              <w:rPr>
-                <w:rtl w:val="0"/>
-              </w:rPr>
+              </w:rPr>
+              <w:t xml:space="preserve">fn_contexto_usuario · usuario_rol · rol</w:t>
             </w:r>
           </w:p>
         </w:tc>
@@ -3069,7 +3158,6 @@
       <w:tr>
         <w:trPr>
           <w:cantSplit w:val="1"/>
-          <w:tblHeader w:val="0"/>
         </w:trPr>
         <w:tc>
           <w:tcPr>
@@ -3085,14 +3173,8 @@
                 <w:rFonts w:ascii="Calibri" w:cs="Calibri" w:eastAsia="Calibri" w:hAnsi="Calibri"/>
                 <w:sz w:val="18"/>
                 <w:szCs w:val="18"/>
-                <w:rtl w:val="0"/>
-              </w:rPr>
-              <w:t xml:space="preserve">HU02.1 Registrar antecedentes de práctica</w:t>
-            </w:r>
-            <w:r>
-              <w:rPr>
-                <w:rtl w:val="0"/>
-              </w:rPr>
+              </w:rPr>
+              <w:t xml:space="preserve">HU01.3 Cerrar sesión</w:t>
             </w:r>
           </w:p>
         </w:tc>
@@ -3110,14 +3192,8 @@
                 <w:rFonts w:ascii="Calibri" w:cs="Calibri" w:eastAsia="Calibri" w:hAnsi="Calibri"/>
                 <w:sz w:val="18"/>
                 <w:szCs w:val="18"/>
-                <w:rtl w:val="0"/>
-              </w:rPr>
-              <w:t xml:space="preserve">PracticaForm · PracticaService</w:t>
-            </w:r>
-            <w:r>
-              <w:rPr>
-                <w:rtl w:val="0"/>
-              </w:rPr>
+              </w:rPr>
+              <w:t xml:space="preserve">Home.cerrarSesion() · AuthStore</w:t>
             </w:r>
           </w:p>
         </w:tc>
@@ -3135,14 +3211,8 @@
                 <w:rFonts w:ascii="Calibri" w:cs="Calibri" w:eastAsia="Calibri" w:hAnsi="Calibri"/>
                 <w:sz w:val="18"/>
                 <w:szCs w:val="18"/>
-                <w:rtl w:val="0"/>
-              </w:rPr>
-              <w:t xml:space="preserve">POST /practicas · GET /empresas/consulta/{rut}</w:t>
-            </w:r>
-            <w:r>
-              <w:rPr>
-                <w:rtl w:val="0"/>
-              </w:rPr>
+              </w:rPr>
+              <w:t xml:space="preserve">— (se elimina el JWT en el cliente)</w:t>
             </w:r>
           </w:p>
         </w:tc>
@@ -3160,14 +3230,8 @@
                 <w:rFonts w:ascii="Calibri" w:cs="Calibri" w:eastAsia="Calibri" w:hAnsi="Calibri"/>
                 <w:sz w:val="18"/>
                 <w:szCs w:val="18"/>
-                <w:rtl w:val="0"/>
-              </w:rPr>
-              <w:t xml:space="preserve">fn_registrar_practica · practica · centro_practica · historial_estado</w:t>
-            </w:r>
-            <w:r>
-              <w:rPr>
-                <w:rtl w:val="0"/>
-              </w:rPr>
+              </w:rPr>
+              <w:t xml:space="preserve">—</w:t>
             </w:r>
           </w:p>
         </w:tc>
@@ -3175,7 +3239,6 @@
       <w:tr>
         <w:trPr>
           <w:cantSplit w:val="1"/>
-          <w:tblHeader w:val="0"/>
         </w:trPr>
         <w:tc>
           <w:tcPr>
@@ -3191,14 +3254,8 @@
                 <w:rFonts w:ascii="Calibri" w:cs="Calibri" w:eastAsia="Calibri" w:hAnsi="Calibri"/>
                 <w:sz w:val="18"/>
                 <w:szCs w:val="18"/>
-                <w:rtl w:val="0"/>
-              </w:rPr>
-              <w:t xml:space="preserve">HU02.2 Validar información obligatoria</w:t>
-            </w:r>
-            <w:r>
-              <w:rPr>
-                <w:rtl w:val="0"/>
-              </w:rPr>
+              </w:rPr>
+              <w:t xml:space="preserve">Apoyo: Registrarse en el sistema</w:t>
             </w:r>
           </w:p>
         </w:tc>
@@ -3216,14 +3273,8 @@
                 <w:rFonts w:ascii="Calibri" w:cs="Calibri" w:eastAsia="Calibri" w:hAnsi="Calibri"/>
                 <w:sz w:val="18"/>
                 <w:szCs w:val="18"/>
-                <w:rtl w:val="0"/>
-              </w:rPr>
-              <w:t xml:space="preserve">PracticaForm (validadores) · rutValidator</w:t>
-            </w:r>
-            <w:r>
-              <w:rPr>
-                <w:rtl w:val="0"/>
-              </w:rPr>
+              </w:rPr>
+              <w:t xml:space="preserve">Login.registrarse() · AuthService</w:t>
             </w:r>
           </w:p>
         </w:tc>
@@ -3241,14 +3292,8 @@
                 <w:rFonts w:ascii="Calibri" w:cs="Calibri" w:eastAsia="Calibri" w:hAnsi="Calibri"/>
                 <w:sz w:val="18"/>
                 <w:szCs w:val="18"/>
-                <w:rtl w:val="0"/>
-              </w:rPr>
-              <w:t xml:space="preserve">Esquemas Pydantic PracticaCreate y CentroPracticaCreate</w:t>
-            </w:r>
-            <w:r>
-              <w:rPr>
-                <w:rtl w:val="0"/>
-              </w:rPr>
+              </w:rPr>
+              <w:t xml:space="preserve">POST /auth/register</w:t>
             </w:r>
           </w:p>
         </w:tc>
@@ -3266,14 +3311,8 @@
                 <w:rFonts w:ascii="Calibri" w:cs="Calibri" w:eastAsia="Calibri" w:hAnsi="Calibri"/>
                 <w:sz w:val="18"/>
                 <w:szCs w:val="18"/>
-                <w:rtl w:val="0"/>
-              </w:rPr>
-              <w:t xml:space="preserve">chk_practica_fechas · chk_practica_horas</w:t>
-            </w:r>
-            <w:r>
-              <w:rPr>
-                <w:rtl w:val="0"/>
-              </w:rPr>
+              </w:rPr>
+              <w:t xml:space="preserve">fn_registrar_usuario_estudiante · usuario · usuario_rol</w:t>
             </w:r>
           </w:p>
         </w:tc>
@@ -3281,7 +3320,6 @@
       <w:tr>
         <w:trPr>
           <w:cantSplit w:val="1"/>
-          <w:tblHeader w:val="0"/>
         </w:trPr>
         <w:tc>
           <w:tcPr>
@@ -3297,14 +3335,8 @@
                 <w:rFonts w:ascii="Calibri" w:cs="Calibri" w:eastAsia="Calibri" w:hAnsi="Calibri"/>
                 <w:sz w:val="18"/>
                 <w:szCs w:val="18"/>
-                <w:rtl w:val="0"/>
-              </w:rPr>
-              <w:t xml:space="preserve">HU02.3 Consultar práctica registrada</w:t>
-            </w:r>
-            <w:r>
-              <w:rPr>
-                <w:rtl w:val="0"/>
-              </w:rPr>
+              </w:rPr>
+              <w:t xml:space="preserve">Apoyo: Gestionar usuarios y roles</w:t>
             </w:r>
           </w:p>
         </w:tc>
@@ -3322,14 +3354,8 @@
                 <w:rFonts w:ascii="Calibri" w:cs="Calibri" w:eastAsia="Calibri" w:hAnsi="Calibri"/>
                 <w:sz w:val="18"/>
                 <w:szCs w:val="18"/>
-                <w:rtl w:val="0"/>
-              </w:rPr>
-              <w:t xml:space="preserve">Home · PracticaService</w:t>
-            </w:r>
-            <w:r>
-              <w:rPr>
-                <w:rtl w:val="0"/>
-              </w:rPr>
+              </w:rPr>
+              <w:t xml:space="preserve">Usuarios · UsuarioService</w:t>
             </w:r>
           </w:p>
         </w:tc>
@@ -3347,14 +3373,8 @@
                 <w:rFonts w:ascii="Calibri" w:cs="Calibri" w:eastAsia="Calibri" w:hAnsi="Calibri"/>
                 <w:sz w:val="18"/>
                 <w:szCs w:val="18"/>
-                <w:rtl w:val="0"/>
-              </w:rPr>
-              <w:t xml:space="preserve">GET /practicas/me</w:t>
-            </w:r>
-            <w:r>
-              <w:rPr>
-                <w:rtl w:val="0"/>
-              </w:rPr>
+              </w:rPr>
+              <w:t xml:space="preserve">GET, POST /usuarios · PATCH /usuarios/{id} · GET /usuarios/roles</w:t>
             </w:r>
           </w:p>
         </w:tc>
@@ -3372,14 +3392,8 @@
                 <w:rFonts w:ascii="Calibri" w:cs="Calibri" w:eastAsia="Calibri" w:hAnsi="Calibri"/>
                 <w:sz w:val="18"/>
                 <w:szCs w:val="18"/>
-                <w:rtl w:val="0"/>
-              </w:rPr>
-              <w:t xml:space="preserve">practica · estado_practica · centro_practica</w:t>
-            </w:r>
-            <w:r>
-              <w:rPr>
-                <w:rtl w:val="0"/>
-              </w:rPr>
+              </w:rPr>
+              <w:t xml:space="preserve">fn_crear_usuario_admin · fn_actualizar_usuario_admin</w:t>
             </w:r>
           </w:p>
         </w:tc>
@@ -3387,105 +3401,29 @@
       <w:tr>
         <w:trPr>
           <w:cantSplit w:val="1"/>
-          <w:tblHeader w:val="0"/>
         </w:trPr>
         <w:tc>
           <w:tcPr>
+            <w:gridSpan w:val="4"/>
+            <w:shd w:fill="DCE6F2" w:val="clear"/>
             <w:vAlign w:val="center"/>
           </w:tcPr>
           <w:p>
             <w:pPr>
+              <w:keepNext w:val="1"/>
               <w:spacing w:after="30" w:before="30" w:lineRule="auto"/>
               <w:rPr/>
             </w:pPr>
             <w:r>
               <w:rPr>
                 <w:rFonts w:ascii="Calibri" w:cs="Calibri" w:eastAsia="Calibri" w:hAnsi="Calibri"/>
+                <w:b w:val="1"/>
+                <w:bCs w:val="1"/>
+                <w:color w:val="2F5597"/>
                 <w:sz w:val="18"/>
                 <w:szCs w:val="18"/>
-                <w:rtl w:val="0"/>
-              </w:rPr>
-              <w:t xml:space="preserve">HU03.1 Visualizar solicitudes</w:t>
-            </w:r>
-            <w:r>
-              <w:rPr>
-                <w:rtl w:val="0"/>
-              </w:rPr>
-            </w:r>
-          </w:p>
-        </w:tc>
-        <w:tc>
-          <w:tcPr>
-            <w:vAlign w:val="center"/>
-          </w:tcPr>
-          <w:p>
-            <w:pPr>
-              <w:spacing w:after="30" w:before="30" w:lineRule="auto"/>
-              <w:rPr/>
-            </w:pPr>
-            <w:r>
-              <w:rPr>
-                <w:rFonts w:ascii="Calibri" w:cs="Calibri" w:eastAsia="Calibri" w:hAnsi="Calibri"/>
-                <w:sz w:val="18"/>
-                <w:szCs w:val="18"/>
-                <w:rtl w:val="0"/>
-              </w:rPr>
-              <w:t xml:space="preserve">Revisiones · RevisionService</w:t>
-            </w:r>
-            <w:r>
-              <w:rPr>
-                <w:rtl w:val="0"/>
-              </w:rPr>
-            </w:r>
-          </w:p>
-        </w:tc>
-        <w:tc>
-          <w:tcPr>
-            <w:vAlign w:val="center"/>
-          </w:tcPr>
-          <w:p>
-            <w:pPr>
-              <w:spacing w:after="30" w:before="30" w:lineRule="auto"/>
-              <w:rPr/>
-            </w:pPr>
-            <w:r>
-              <w:rPr>
-                <w:rFonts w:ascii="Calibri" w:cs="Calibri" w:eastAsia="Calibri" w:hAnsi="Calibri"/>
-                <w:sz w:val="18"/>
-                <w:szCs w:val="18"/>
-                <w:rtl w:val="0"/>
-              </w:rPr>
-              <w:t xml:space="preserve">GET /revisiones/solicitudes</w:t>
-            </w:r>
-            <w:r>
-              <w:rPr>
-                <w:rtl w:val="0"/>
-              </w:rPr>
-            </w:r>
-          </w:p>
-        </w:tc>
-        <w:tc>
-          <w:tcPr>
-            <w:vAlign w:val="center"/>
-          </w:tcPr>
-          <w:p>
-            <w:pPr>
-              <w:spacing w:after="30" w:before="30" w:lineRule="auto"/>
-              <w:rPr/>
-            </w:pPr>
-            <w:r>
-              <w:rPr>
-                <w:rFonts w:ascii="Calibri" w:cs="Calibri" w:eastAsia="Calibri" w:hAnsi="Calibri"/>
-                <w:sz w:val="18"/>
-                <w:szCs w:val="18"/>
-                <w:rtl w:val="0"/>
-              </w:rPr>
-              <w:t xml:space="preserve">practica · estudiante · estado_practica</w:t>
-            </w:r>
-            <w:r>
-              <w:rPr>
-                <w:rtl w:val="0"/>
-              </w:rPr>
+              </w:rPr>
+              <w:t xml:space="preserve">EP02 — Registro de práctica profesional · semanas 6 y 7 · implementada (Release 1.1)</w:t>
             </w:r>
           </w:p>
         </w:tc>
@@ -3493,7 +3431,6 @@
       <w:tr>
         <w:trPr>
           <w:cantSplit w:val="1"/>
-          <w:tblHeader w:val="0"/>
         </w:trPr>
         <w:tc>
           <w:tcPr>
@@ -3509,14 +3446,8 @@
                 <w:rFonts w:ascii="Calibri" w:cs="Calibri" w:eastAsia="Calibri" w:hAnsi="Calibri"/>
                 <w:sz w:val="18"/>
                 <w:szCs w:val="18"/>
-                <w:rtl w:val="0"/>
-              </w:rPr>
-              <w:t xml:space="preserve">HU03.2 Consultar antecedentes de una solicitud</w:t>
-            </w:r>
-            <w:r>
-              <w:rPr>
-                <w:rtl w:val="0"/>
-              </w:rPr>
+              </w:rPr>
+              <w:t xml:space="preserve">Apoyo: Completar perfil de estudiante</w:t>
             </w:r>
           </w:p>
         </w:tc>
@@ -3534,14 +3465,8 @@
                 <w:rFonts w:ascii="Calibri" w:cs="Calibri" w:eastAsia="Calibri" w:hAnsi="Calibri"/>
                 <w:sz w:val="18"/>
                 <w:szCs w:val="18"/>
-                <w:rtl w:val="0"/>
-              </w:rPr>
-              <w:t xml:space="preserve">RevisionDetalle · RevisionService</w:t>
-            </w:r>
-            <w:r>
-              <w:rPr>
-                <w:rtl w:val="0"/>
-              </w:rPr>
+              </w:rPr>
+              <w:t xml:space="preserve">Home · EstudianteService</w:t>
             </w:r>
           </w:p>
         </w:tc>
@@ -3559,14 +3484,8 @@
                 <w:rFonts w:ascii="Calibri" w:cs="Calibri" w:eastAsia="Calibri" w:hAnsi="Calibri"/>
                 <w:sz w:val="18"/>
                 <w:szCs w:val="18"/>
-                <w:rtl w:val="0"/>
-              </w:rPr>
-              <w:t xml:space="preserve">GET /revisiones/solicitudes/{id}</w:t>
-            </w:r>
-            <w:r>
-              <w:rPr>
-                <w:rtl w:val="0"/>
-              </w:rPr>
+              </w:rPr>
+              <w:t xml:space="preserve">POST /estudiantes/perfil</w:t>
             </w:r>
           </w:p>
         </w:tc>
@@ -3584,14 +3503,8 @@
                 <w:rFonts w:ascii="Calibri" w:cs="Calibri" w:eastAsia="Calibri" w:hAnsi="Calibri"/>
                 <w:sz w:val="18"/>
                 <w:szCs w:val="18"/>
-                <w:rtl w:val="0"/>
-              </w:rPr>
-              <w:t xml:space="preserve">practica · estudiante · usuario · centro_practica</w:t>
-            </w:r>
-            <w:r>
-              <w:rPr>
-                <w:rtl w:val="0"/>
-              </w:rPr>
+              </w:rPr>
+              <w:t xml:space="preserve">fn_completar_perfil_estudiante · estudiante</w:t>
             </w:r>
           </w:p>
         </w:tc>
@@ -3599,7 +3512,6 @@
       <w:tr>
         <w:trPr>
           <w:cantSplit w:val="1"/>
-          <w:tblHeader w:val="0"/>
         </w:trPr>
         <w:tc>
           <w:tcPr>
@@ -3615,14 +3527,8 @@
                 <w:rFonts w:ascii="Calibri" w:cs="Calibri" w:eastAsia="Calibri" w:hAnsi="Calibri"/>
                 <w:sz w:val="18"/>
                 <w:szCs w:val="18"/>
-                <w:rtl w:val="0"/>
-              </w:rPr>
-              <w:t xml:space="preserve">HU03.3 Resolver una solicitud</w:t>
-            </w:r>
-            <w:r>
-              <w:rPr>
-                <w:rtl w:val="0"/>
-              </w:rPr>
+              </w:rPr>
+              <w:t xml:space="preserve">HU02.1 Registrar antecedentes de práctica</w:t>
             </w:r>
           </w:p>
         </w:tc>
@@ -3640,14 +3546,8 @@
                 <w:rFonts w:ascii="Calibri" w:cs="Calibri" w:eastAsia="Calibri" w:hAnsi="Calibri"/>
                 <w:sz w:val="18"/>
                 <w:szCs w:val="18"/>
-                <w:rtl w:val="0"/>
-              </w:rPr>
-              <w:t xml:space="preserve">RevisionDetalle · RevisionService</w:t>
-            </w:r>
-            <w:r>
-              <w:rPr>
-                <w:rtl w:val="0"/>
-              </w:rPr>
+              </w:rPr>
+              <w:t xml:space="preserve">PracticaForm · PracticaService</w:t>
             </w:r>
           </w:p>
         </w:tc>
@@ -3665,14 +3565,8 @@
                 <w:rFonts w:ascii="Calibri" w:cs="Calibri" w:eastAsia="Calibri" w:hAnsi="Calibri"/>
                 <w:sz w:val="18"/>
                 <w:szCs w:val="18"/>
-                <w:rtl w:val="0"/>
-              </w:rPr>
-              <w:t xml:space="preserve">PATCH /revisiones/solicitudes/{id}</w:t>
-            </w:r>
-            <w:r>
-              <w:rPr>
-                <w:rtl w:val="0"/>
-              </w:rPr>
+              </w:rPr>
+              <w:t xml:space="preserve">POST /practicas</w:t>
             </w:r>
           </w:p>
         </w:tc>
@@ -3690,14 +3584,821 @@
                 <w:rFonts w:ascii="Calibri" w:cs="Calibri" w:eastAsia="Calibri" w:hAnsi="Calibri"/>
                 <w:sz w:val="18"/>
                 <w:szCs w:val="18"/>
-                <w:rtl w:val="0"/>
+              </w:rPr>
+              <w:t xml:space="preserve">fn_registrar_practica · practica · centro_practica · historial_estado</w:t>
+            </w:r>
+          </w:p>
+        </w:tc>
+      </w:tr>
+      <w:tr>
+        <w:trPr>
+          <w:cantSplit w:val="1"/>
+        </w:trPr>
+        <w:tc>
+          <w:tcPr>
+            <w:vAlign w:val="center"/>
+          </w:tcPr>
+          <w:p>
+            <w:pPr>
+              <w:spacing w:after="30" w:before="30" w:lineRule="auto"/>
+              <w:rPr/>
+            </w:pPr>
+            <w:r>
+              <w:rPr>
+                <w:rFonts w:ascii="Calibri" w:cs="Calibri" w:eastAsia="Calibri" w:hAnsi="Calibri"/>
+                <w:sz w:val="18"/>
+                <w:szCs w:val="18"/>
+              </w:rPr>
+              <w:t xml:space="preserve">Apoyo: Buscar empresa por RUT</w:t>
+            </w:r>
+          </w:p>
+        </w:tc>
+        <w:tc>
+          <w:tcPr>
+            <w:vAlign w:val="center"/>
+          </w:tcPr>
+          <w:p>
+            <w:pPr>
+              <w:spacing w:after="30" w:before="30" w:lineRule="auto"/>
+              <w:rPr/>
+            </w:pPr>
+            <w:r>
+              <w:rPr>
+                <w:rFonts w:ascii="Calibri" w:cs="Calibri" w:eastAsia="Calibri" w:hAnsi="Calibri"/>
+                <w:sz w:val="18"/>
+                <w:szCs w:val="18"/>
+              </w:rPr>
+              <w:t xml:space="preserve">PracticaForm · PracticaService</w:t>
+            </w:r>
+          </w:p>
+        </w:tc>
+        <w:tc>
+          <w:tcPr>
+            <w:vAlign w:val="center"/>
+          </w:tcPr>
+          <w:p>
+            <w:pPr>
+              <w:spacing w:after="30" w:before="30" w:lineRule="auto"/>
+              <w:rPr/>
+            </w:pPr>
+            <w:r>
+              <w:rPr>
+                <w:rFonts w:ascii="Calibri" w:cs="Calibri" w:eastAsia="Calibri" w:hAnsi="Calibri"/>
+                <w:sz w:val="18"/>
+                <w:szCs w:val="18"/>
+              </w:rPr>
+              <w:t xml:space="preserve">GET /empresas/consulta/{rut}</w:t>
+            </w:r>
+          </w:p>
+        </w:tc>
+        <w:tc>
+          <w:tcPr>
+            <w:vAlign w:val="center"/>
+          </w:tcPr>
+          <w:p>
+            <w:pPr>
+              <w:spacing w:after="30" w:before="30" w:lineRule="auto"/>
+              <w:rPr/>
+            </w:pPr>
+            <w:r>
+              <w:rPr>
+                <w:rFonts w:ascii="Calibri" w:cs="Calibri" w:eastAsia="Calibri" w:hAnsi="Calibri"/>
+                <w:sz w:val="18"/>
+                <w:szCs w:val="18"/>
+              </w:rPr>
+              <w:t xml:space="preserve">fn_obtener_empresa_cache · fn_guardar_empresa_cache · empresa</w:t>
+            </w:r>
+          </w:p>
+        </w:tc>
+      </w:tr>
+      <w:tr>
+        <w:trPr>
+          <w:cantSplit w:val="1"/>
+        </w:trPr>
+        <w:tc>
+          <w:tcPr>
+            <w:vAlign w:val="center"/>
+          </w:tcPr>
+          <w:p>
+            <w:pPr>
+              <w:spacing w:after="30" w:before="30" w:lineRule="auto"/>
+              <w:rPr/>
+            </w:pPr>
+            <w:r>
+              <w:rPr>
+                <w:rFonts w:ascii="Calibri" w:cs="Calibri" w:eastAsia="Calibri" w:hAnsi="Calibri"/>
+                <w:sz w:val="18"/>
+                <w:szCs w:val="18"/>
+              </w:rPr>
+              <w:t xml:space="preserve">HU02.2 Validar información obligatoria</w:t>
+            </w:r>
+          </w:p>
+        </w:tc>
+        <w:tc>
+          <w:tcPr>
+            <w:vAlign w:val="center"/>
+          </w:tcPr>
+          <w:p>
+            <w:pPr>
+              <w:spacing w:after="30" w:before="30" w:lineRule="auto"/>
+              <w:rPr/>
+            </w:pPr>
+            <w:r>
+              <w:rPr>
+                <w:rFonts w:ascii="Calibri" w:cs="Calibri" w:eastAsia="Calibri" w:hAnsi="Calibri"/>
+                <w:sz w:val="18"/>
+                <w:szCs w:val="18"/>
+              </w:rPr>
+              <w:t xml:space="preserve">PracticaForm (validadores) · rutValidator</w:t>
+            </w:r>
+          </w:p>
+        </w:tc>
+        <w:tc>
+          <w:tcPr>
+            <w:vAlign w:val="center"/>
+          </w:tcPr>
+          <w:p>
+            <w:pPr>
+              <w:spacing w:after="30" w:before="30" w:lineRule="auto"/>
+              <w:rPr/>
+            </w:pPr>
+            <w:r>
+              <w:rPr>
+                <w:rFonts w:ascii="Calibri" w:cs="Calibri" w:eastAsia="Calibri" w:hAnsi="Calibri"/>
+                <w:sz w:val="18"/>
+                <w:szCs w:val="18"/>
+              </w:rPr>
+              <w:t xml:space="preserve">Esquemas Pydantic PracticaCreate y CentroPracticaCreate</w:t>
+            </w:r>
+          </w:p>
+        </w:tc>
+        <w:tc>
+          <w:tcPr>
+            <w:vAlign w:val="center"/>
+          </w:tcPr>
+          <w:p>
+            <w:pPr>
+              <w:spacing w:after="30" w:before="30" w:lineRule="auto"/>
+              <w:rPr/>
+            </w:pPr>
+            <w:r>
+              <w:rPr>
+                <w:rFonts w:ascii="Calibri" w:cs="Calibri" w:eastAsia="Calibri" w:hAnsi="Calibri"/>
+                <w:sz w:val="18"/>
+                <w:szCs w:val="18"/>
+              </w:rPr>
+              <w:t xml:space="preserve">chk_practica_fechas · chk_practica_horas</w:t>
+            </w:r>
+          </w:p>
+        </w:tc>
+      </w:tr>
+      <w:tr>
+        <w:trPr>
+          <w:cantSplit w:val="1"/>
+        </w:trPr>
+        <w:tc>
+          <w:tcPr>
+            <w:vAlign w:val="center"/>
+          </w:tcPr>
+          <w:p>
+            <w:pPr>
+              <w:spacing w:after="30" w:before="30" w:lineRule="auto"/>
+              <w:rPr/>
+            </w:pPr>
+            <w:r>
+              <w:rPr>
+                <w:rFonts w:ascii="Calibri" w:cs="Calibri" w:eastAsia="Calibri" w:hAnsi="Calibri"/>
+                <w:sz w:val="18"/>
+                <w:szCs w:val="18"/>
+              </w:rPr>
+              <w:t xml:space="preserve">HU02.3 Consultar práctica registrada</w:t>
+            </w:r>
+          </w:p>
+        </w:tc>
+        <w:tc>
+          <w:tcPr>
+            <w:vAlign w:val="center"/>
+          </w:tcPr>
+          <w:p>
+            <w:pPr>
+              <w:spacing w:after="30" w:before="30" w:lineRule="auto"/>
+              <w:rPr/>
+            </w:pPr>
+            <w:r>
+              <w:rPr>
+                <w:rFonts w:ascii="Calibri" w:cs="Calibri" w:eastAsia="Calibri" w:hAnsi="Calibri"/>
+                <w:sz w:val="18"/>
+                <w:szCs w:val="18"/>
+              </w:rPr>
+              <w:t xml:space="preserve">Home · PracticaService</w:t>
+            </w:r>
+          </w:p>
+        </w:tc>
+        <w:tc>
+          <w:tcPr>
+            <w:vAlign w:val="center"/>
+          </w:tcPr>
+          <w:p>
+            <w:pPr>
+              <w:spacing w:after="30" w:before="30" w:lineRule="auto"/>
+              <w:rPr/>
+            </w:pPr>
+            <w:r>
+              <w:rPr>
+                <w:rFonts w:ascii="Calibri" w:cs="Calibri" w:eastAsia="Calibri" w:hAnsi="Calibri"/>
+                <w:sz w:val="18"/>
+                <w:szCs w:val="18"/>
+              </w:rPr>
+              <w:t xml:space="preserve">GET /practicas/me</w:t>
+            </w:r>
+          </w:p>
+        </w:tc>
+        <w:tc>
+          <w:tcPr>
+            <w:vAlign w:val="center"/>
+          </w:tcPr>
+          <w:p>
+            <w:pPr>
+              <w:spacing w:after="30" w:before="30" w:lineRule="auto"/>
+              <w:rPr/>
+            </w:pPr>
+            <w:r>
+              <w:rPr>
+                <w:rFonts w:ascii="Calibri" w:cs="Calibri" w:eastAsia="Calibri" w:hAnsi="Calibri"/>
+                <w:sz w:val="18"/>
+                <w:szCs w:val="18"/>
+              </w:rPr>
+              <w:t xml:space="preserve">practica · estado_practica · centro_practica</w:t>
+            </w:r>
+          </w:p>
+        </w:tc>
+      </w:tr>
+      <w:tr>
+        <w:trPr>
+          <w:cantSplit w:val="1"/>
+        </w:trPr>
+        <w:tc>
+          <w:tcPr>
+            <w:gridSpan w:val="4"/>
+            <w:shd w:fill="DCE6F2" w:val="clear"/>
+            <w:vAlign w:val="center"/>
+          </w:tcPr>
+          <w:p>
+            <w:pPr>
+              <w:keepNext w:val="1"/>
+              <w:spacing w:after="30" w:before="30" w:lineRule="auto"/>
+              <w:rPr/>
+            </w:pPr>
+            <w:r>
+              <w:rPr>
+                <w:rFonts w:ascii="Calibri" w:cs="Calibri" w:eastAsia="Calibri" w:hAnsi="Calibri"/>
+                <w:b w:val="1"/>
+                <w:bCs w:val="1"/>
+                <w:color w:val="2F5597"/>
+                <w:sz w:val="18"/>
+                <w:szCs w:val="18"/>
+              </w:rPr>
+              <w:t xml:space="preserve">EP03 — Revisión y validación de prácticas · semanas 7 y 8 · implementada (Release 1.1)</w:t>
+            </w:r>
+          </w:p>
+        </w:tc>
+      </w:tr>
+      <w:tr>
+        <w:trPr>
+          <w:cantSplit w:val="1"/>
+        </w:trPr>
+        <w:tc>
+          <w:tcPr>
+            <w:vAlign w:val="center"/>
+          </w:tcPr>
+          <w:p>
+            <w:pPr>
+              <w:spacing w:after="30" w:before="30" w:lineRule="auto"/>
+              <w:rPr/>
+            </w:pPr>
+            <w:r>
+              <w:rPr>
+                <w:rFonts w:ascii="Calibri" w:cs="Calibri" w:eastAsia="Calibri" w:hAnsi="Calibri"/>
+                <w:sz w:val="18"/>
+                <w:szCs w:val="18"/>
+              </w:rPr>
+              <w:t xml:space="preserve">HU03.1 Visualizar solicitudes</w:t>
+            </w:r>
+          </w:p>
+        </w:tc>
+        <w:tc>
+          <w:tcPr>
+            <w:vAlign w:val="center"/>
+          </w:tcPr>
+          <w:p>
+            <w:pPr>
+              <w:spacing w:after="30" w:before="30" w:lineRule="auto"/>
+              <w:rPr/>
+            </w:pPr>
+            <w:r>
+              <w:rPr>
+                <w:rFonts w:ascii="Calibri" w:cs="Calibri" w:eastAsia="Calibri" w:hAnsi="Calibri"/>
+                <w:sz w:val="18"/>
+                <w:szCs w:val="18"/>
+              </w:rPr>
+              <w:t xml:space="preserve">Revisiones · RevisionService</w:t>
+            </w:r>
+          </w:p>
+        </w:tc>
+        <w:tc>
+          <w:tcPr>
+            <w:vAlign w:val="center"/>
+          </w:tcPr>
+          <w:p>
+            <w:pPr>
+              <w:spacing w:after="30" w:before="30" w:lineRule="auto"/>
+              <w:rPr/>
+            </w:pPr>
+            <w:r>
+              <w:rPr>
+                <w:rFonts w:ascii="Calibri" w:cs="Calibri" w:eastAsia="Calibri" w:hAnsi="Calibri"/>
+                <w:sz w:val="18"/>
+                <w:szCs w:val="18"/>
+              </w:rPr>
+              <w:t xml:space="preserve">GET /revisiones/solicitudes</w:t>
+            </w:r>
+          </w:p>
+        </w:tc>
+        <w:tc>
+          <w:tcPr>
+            <w:vAlign w:val="center"/>
+          </w:tcPr>
+          <w:p>
+            <w:pPr>
+              <w:spacing w:after="30" w:before="30" w:lineRule="auto"/>
+              <w:rPr/>
+            </w:pPr>
+            <w:r>
+              <w:rPr>
+                <w:rFonts w:ascii="Calibri" w:cs="Calibri" w:eastAsia="Calibri" w:hAnsi="Calibri"/>
+                <w:sz w:val="18"/>
+                <w:szCs w:val="18"/>
+              </w:rPr>
+              <w:t xml:space="preserve">practica · estudiante · estado_practica</w:t>
+            </w:r>
+          </w:p>
+        </w:tc>
+      </w:tr>
+      <w:tr>
+        <w:trPr>
+          <w:cantSplit w:val="1"/>
+        </w:trPr>
+        <w:tc>
+          <w:tcPr>
+            <w:vAlign w:val="center"/>
+          </w:tcPr>
+          <w:p>
+            <w:pPr>
+              <w:spacing w:after="30" w:before="30" w:lineRule="auto"/>
+              <w:rPr/>
+            </w:pPr>
+            <w:r>
+              <w:rPr>
+                <w:rFonts w:ascii="Calibri" w:cs="Calibri" w:eastAsia="Calibri" w:hAnsi="Calibri"/>
+                <w:sz w:val="18"/>
+                <w:szCs w:val="18"/>
+              </w:rPr>
+              <w:t xml:space="preserve">HU03.2 Consultar antecedentes de una solicitud</w:t>
+            </w:r>
+          </w:p>
+        </w:tc>
+        <w:tc>
+          <w:tcPr>
+            <w:vAlign w:val="center"/>
+          </w:tcPr>
+          <w:p>
+            <w:pPr>
+              <w:spacing w:after="30" w:before="30" w:lineRule="auto"/>
+              <w:rPr/>
+            </w:pPr>
+            <w:r>
+              <w:rPr>
+                <w:rFonts w:ascii="Calibri" w:cs="Calibri" w:eastAsia="Calibri" w:hAnsi="Calibri"/>
+                <w:sz w:val="18"/>
+                <w:szCs w:val="18"/>
+              </w:rPr>
+              <w:t xml:space="preserve">RevisionDetalle · RevisionService</w:t>
+            </w:r>
+          </w:p>
+        </w:tc>
+        <w:tc>
+          <w:tcPr>
+            <w:vAlign w:val="center"/>
+          </w:tcPr>
+          <w:p>
+            <w:pPr>
+              <w:spacing w:after="30" w:before="30" w:lineRule="auto"/>
+              <w:rPr/>
+            </w:pPr>
+            <w:r>
+              <w:rPr>
+                <w:rFonts w:ascii="Calibri" w:cs="Calibri" w:eastAsia="Calibri" w:hAnsi="Calibri"/>
+                <w:sz w:val="18"/>
+                <w:szCs w:val="18"/>
+              </w:rPr>
+              <w:t xml:space="preserve">GET /revisiones/solicitudes/{id}</w:t>
+            </w:r>
+          </w:p>
+        </w:tc>
+        <w:tc>
+          <w:tcPr>
+            <w:vAlign w:val="center"/>
+          </w:tcPr>
+          <w:p>
+            <w:pPr>
+              <w:spacing w:after="30" w:before="30" w:lineRule="auto"/>
+              <w:rPr/>
+            </w:pPr>
+            <w:r>
+              <w:rPr>
+                <w:rFonts w:ascii="Calibri" w:cs="Calibri" w:eastAsia="Calibri" w:hAnsi="Calibri"/>
+                <w:sz w:val="18"/>
+                <w:szCs w:val="18"/>
+              </w:rPr>
+              <w:t xml:space="preserve">practica · estudiante · usuario · centro_practica</w:t>
+            </w:r>
+          </w:p>
+        </w:tc>
+      </w:tr>
+      <w:tr>
+        <w:trPr>
+          <w:cantSplit w:val="1"/>
+        </w:trPr>
+        <w:tc>
+          <w:tcPr>
+            <w:vAlign w:val="center"/>
+          </w:tcPr>
+          <w:p>
+            <w:pPr>
+              <w:spacing w:after="30" w:before="30" w:lineRule="auto"/>
+              <w:rPr/>
+            </w:pPr>
+            <w:r>
+              <w:rPr>
+                <w:rFonts w:ascii="Calibri" w:cs="Calibri" w:eastAsia="Calibri" w:hAnsi="Calibri"/>
+                <w:sz w:val="18"/>
+                <w:szCs w:val="18"/>
+              </w:rPr>
+              <w:t xml:space="preserve">HU03.3 Resolver una solicitud</w:t>
+            </w:r>
+          </w:p>
+        </w:tc>
+        <w:tc>
+          <w:tcPr>
+            <w:vAlign w:val="center"/>
+          </w:tcPr>
+          <w:p>
+            <w:pPr>
+              <w:spacing w:after="30" w:before="30" w:lineRule="auto"/>
+              <w:rPr/>
+            </w:pPr>
+            <w:r>
+              <w:rPr>
+                <w:rFonts w:ascii="Calibri" w:cs="Calibri" w:eastAsia="Calibri" w:hAnsi="Calibri"/>
+                <w:sz w:val="18"/>
+                <w:szCs w:val="18"/>
+              </w:rPr>
+              <w:t xml:space="preserve">RevisionDetalle · RevisionService</w:t>
+            </w:r>
+          </w:p>
+        </w:tc>
+        <w:tc>
+          <w:tcPr>
+            <w:vAlign w:val="center"/>
+          </w:tcPr>
+          <w:p>
+            <w:pPr>
+              <w:spacing w:after="30" w:before="30" w:lineRule="auto"/>
+              <w:rPr/>
+            </w:pPr>
+            <w:r>
+              <w:rPr>
+                <w:rFonts w:ascii="Calibri" w:cs="Calibri" w:eastAsia="Calibri" w:hAnsi="Calibri"/>
+                <w:sz w:val="18"/>
+                <w:szCs w:val="18"/>
+              </w:rPr>
+              <w:t xml:space="preserve">PATCH /revisiones/solicitudes/{id}</w:t>
+            </w:r>
+          </w:p>
+        </w:tc>
+        <w:tc>
+          <w:tcPr>
+            <w:vAlign w:val="center"/>
+          </w:tcPr>
+          <w:p>
+            <w:pPr>
+              <w:spacing w:after="30" w:before="30" w:lineRule="auto"/>
+              <w:rPr/>
+            </w:pPr>
+            <w:r>
+              <w:rPr>
+                <w:rFonts w:ascii="Calibri" w:cs="Calibri" w:eastAsia="Calibri" w:hAnsi="Calibri"/>
+                <w:sz w:val="18"/>
+                <w:szCs w:val="18"/>
               </w:rPr>
               <w:t xml:space="preserve">fn_revisar_practica · historial_estado</w:t>
             </w:r>
-            <w:r>
-              <w:rPr>
-                <w:rtl w:val="0"/>
-              </w:rPr>
+          </w:p>
+        </w:tc>
+      </w:tr>
+      <w:tr>
+        <w:trPr>
+          <w:cantSplit w:val="1"/>
+        </w:trPr>
+        <w:tc>
+          <w:tcPr>
+            <w:gridSpan w:val="4"/>
+            <w:shd w:fill="DCE6F2" w:val="clear"/>
+            <w:vAlign w:val="center"/>
+          </w:tcPr>
+          <w:p>
+            <w:pPr>
+              <w:keepNext w:val="1"/>
+              <w:spacing w:after="30" w:before="30" w:lineRule="auto"/>
+              <w:rPr/>
+            </w:pPr>
+            <w:r>
+              <w:rPr>
+                <w:rFonts w:ascii="Calibri" w:cs="Calibri" w:eastAsia="Calibri" w:hAnsi="Calibri"/>
+                <w:b w:val="1"/>
+                <w:bCs w:val="1"/>
+                <w:color w:val="2F5597"/>
+                <w:sz w:val="18"/>
+                <w:szCs w:val="18"/>
+              </w:rPr>
+              <w:t xml:space="preserve">EP04 — Gestión de estado de práctica profesional · semanas 8 y 9 · diseño planificado</w:t>
+            </w:r>
+          </w:p>
+        </w:tc>
+      </w:tr>
+      <w:tr>
+        <w:trPr>
+          <w:cantSplit w:val="1"/>
+        </w:trPr>
+        <w:tc>
+          <w:tcPr>
+            <w:vAlign w:val="center"/>
+          </w:tcPr>
+          <w:p>
+            <w:pPr>
+              <w:spacing w:after="30" w:before="30" w:lineRule="auto"/>
+              <w:rPr/>
+            </w:pPr>
+            <w:r>
+              <w:rPr>
+                <w:rFonts w:ascii="Calibri" w:cs="Calibri" w:eastAsia="Calibri" w:hAnsi="Calibri"/>
+                <w:i w:val="1"/>
+                <w:iCs w:val="1"/>
+                <w:sz w:val="18"/>
+                <w:szCs w:val="18"/>
+              </w:rPr>
+              <w:t xml:space="preserve">HU04.1 Consultar estado de una práctica</w:t>
+            </w:r>
+          </w:p>
+        </w:tc>
+        <w:tc>
+          <w:tcPr>
+            <w:vAlign w:val="center"/>
+          </w:tcPr>
+          <w:p>
+            <w:pPr>
+              <w:spacing w:after="30" w:before="30" w:lineRule="auto"/>
+              <w:rPr/>
+            </w:pPr>
+            <w:r>
+              <w:rPr>
+                <w:rFonts w:ascii="Calibri" w:cs="Calibri" w:eastAsia="Calibri" w:hAnsi="Calibri"/>
+                <w:i w:val="1"/>
+                <w:iCs w:val="1"/>
+                <w:sz w:val="18"/>
+                <w:szCs w:val="18"/>
+              </w:rPr>
+              <w:t xml:space="preserve">Home (estudiante) · RevisionDetalle (gestor) · PracticaService</w:t>
+            </w:r>
+          </w:p>
+        </w:tc>
+        <w:tc>
+          <w:tcPr>
+            <w:vAlign w:val="center"/>
+          </w:tcPr>
+          <w:p>
+            <w:pPr>
+              <w:spacing w:after="30" w:before="30" w:lineRule="auto"/>
+              <w:rPr/>
+            </w:pPr>
+            <w:r>
+              <w:rPr>
+                <w:rFonts w:ascii="Calibri" w:cs="Calibri" w:eastAsia="Calibri" w:hAnsi="Calibri"/>
+                <w:i w:val="1"/>
+                <w:iCs w:val="1"/>
+                <w:sz w:val="18"/>
+                <w:szCs w:val="18"/>
+              </w:rPr>
+              <w:t xml:space="preserve">GET /practicas/me · GET /practicas/{id}/estado</w:t>
+            </w:r>
+          </w:p>
+        </w:tc>
+        <w:tc>
+          <w:tcPr>
+            <w:vAlign w:val="center"/>
+          </w:tcPr>
+          <w:p>
+            <w:pPr>
+              <w:spacing w:after="30" w:before="30" w:lineRule="auto"/>
+              <w:rPr/>
+            </w:pPr>
+            <w:r>
+              <w:rPr>
+                <w:rFonts w:ascii="Calibri" w:cs="Calibri" w:eastAsia="Calibri" w:hAnsi="Calibri"/>
+                <w:i w:val="1"/>
+                <w:iCs w:val="1"/>
+                <w:sz w:val="18"/>
+                <w:szCs w:val="18"/>
+              </w:rPr>
+              <w:t xml:space="preserve">practica · estado_practica</w:t>
+            </w:r>
+          </w:p>
+        </w:tc>
+      </w:tr>
+      <w:tr>
+        <w:trPr>
+          <w:cantSplit w:val="1"/>
+        </w:trPr>
+        <w:tc>
+          <w:tcPr>
+            <w:vAlign w:val="center"/>
+          </w:tcPr>
+          <w:p>
+            <w:pPr>
+              <w:spacing w:after="30" w:before="30" w:lineRule="auto"/>
+              <w:rPr/>
+            </w:pPr>
+            <w:r>
+              <w:rPr>
+                <w:rFonts w:ascii="Calibri" w:cs="Calibri" w:eastAsia="Calibri" w:hAnsi="Calibri"/>
+                <w:i w:val="1"/>
+                <w:iCs w:val="1"/>
+                <w:sz w:val="18"/>
+                <w:szCs w:val="18"/>
+              </w:rPr>
+              <w:t xml:space="preserve">HU04.2 Actualizar estado de una práctica</w:t>
+            </w:r>
+          </w:p>
+        </w:tc>
+        <w:tc>
+          <w:tcPr>
+            <w:vAlign w:val="center"/>
+          </w:tcPr>
+          <w:p>
+            <w:pPr>
+              <w:spacing w:after="30" w:before="30" w:lineRule="auto"/>
+              <w:rPr/>
+            </w:pPr>
+            <w:r>
+              <w:rPr>
+                <w:rFonts w:ascii="Calibri" w:cs="Calibri" w:eastAsia="Calibri" w:hAnsi="Calibri"/>
+                <w:i w:val="1"/>
+                <w:iCs w:val="1"/>
+                <w:sz w:val="18"/>
+                <w:szCs w:val="18"/>
+              </w:rPr>
+              <w:t xml:space="preserve">RevisionDetalle (gestor) · PracticaService</w:t>
+            </w:r>
+          </w:p>
+        </w:tc>
+        <w:tc>
+          <w:tcPr>
+            <w:vAlign w:val="center"/>
+          </w:tcPr>
+          <w:p>
+            <w:pPr>
+              <w:spacing w:after="30" w:before="30" w:lineRule="auto"/>
+              <w:rPr/>
+            </w:pPr>
+            <w:r>
+              <w:rPr>
+                <w:rFonts w:ascii="Calibri" w:cs="Calibri" w:eastAsia="Calibri" w:hAnsi="Calibri"/>
+                <w:i w:val="1"/>
+                <w:iCs w:val="1"/>
+                <w:sz w:val="18"/>
+                <w:szCs w:val="18"/>
+              </w:rPr>
+              <w:t xml:space="preserve">PATCH /practicas/{id}/estado</w:t>
+            </w:r>
+          </w:p>
+        </w:tc>
+        <w:tc>
+          <w:tcPr>
+            <w:vAlign w:val="center"/>
+          </w:tcPr>
+          <w:p>
+            <w:pPr>
+              <w:spacing w:after="30" w:before="30" w:lineRule="auto"/>
+              <w:rPr/>
+            </w:pPr>
+            <w:r>
+              <w:rPr>
+                <w:rFonts w:ascii="Calibri" w:cs="Calibri" w:eastAsia="Calibri" w:hAnsi="Calibri"/>
+                <w:i w:val="1"/>
+                <w:iCs w:val="1"/>
+                <w:sz w:val="18"/>
+                <w:szCs w:val="18"/>
+              </w:rPr>
+              <w:t xml:space="preserve">fn_actualizar_estado_practica (nueva) · practica · historial_estado</w:t>
+            </w:r>
+          </w:p>
+        </w:tc>
+      </w:tr>
+      <w:tr>
+        <w:trPr>
+          <w:cantSplit w:val="1"/>
+        </w:trPr>
+        <w:tc>
+          <w:tcPr>
+            <w:vAlign w:val="center"/>
+          </w:tcPr>
+          <w:p>
+            <w:pPr>
+              <w:spacing w:after="30" w:before="30" w:lineRule="auto"/>
+              <w:rPr/>
+            </w:pPr>
+            <w:r>
+              <w:rPr>
+                <w:rFonts w:ascii="Calibri" w:cs="Calibri" w:eastAsia="Calibri" w:hAnsi="Calibri"/>
+                <w:i w:val="1"/>
+                <w:iCs w:val="1"/>
+                <w:sz w:val="18"/>
+                <w:szCs w:val="18"/>
+              </w:rPr>
+              <w:t xml:space="preserve">HU04.3 Consultar historial de estados</w:t>
+            </w:r>
+          </w:p>
+        </w:tc>
+        <w:tc>
+          <w:tcPr>
+            <w:vAlign w:val="center"/>
+          </w:tcPr>
+          <w:p>
+            <w:pPr>
+              <w:spacing w:after="30" w:before="30" w:lineRule="auto"/>
+              <w:rPr/>
+            </w:pPr>
+            <w:r>
+              <w:rPr>
+                <w:rFonts w:ascii="Calibri" w:cs="Calibri" w:eastAsia="Calibri" w:hAnsi="Calibri"/>
+                <w:i w:val="1"/>
+                <w:iCs w:val="1"/>
+                <w:sz w:val="18"/>
+                <w:szCs w:val="18"/>
+              </w:rPr>
+              <w:t xml:space="preserve">HistorialEstados (nuevo componente) · PracticaService</w:t>
+            </w:r>
+          </w:p>
+        </w:tc>
+        <w:tc>
+          <w:tcPr>
+            <w:vAlign w:val="center"/>
+          </w:tcPr>
+          <w:p>
+            <w:pPr>
+              <w:spacing w:after="30" w:before="30" w:lineRule="auto"/>
+              <w:rPr/>
+            </w:pPr>
+            <w:r>
+              <w:rPr>
+                <w:rFonts w:ascii="Calibri" w:cs="Calibri" w:eastAsia="Calibri" w:hAnsi="Calibri"/>
+                <w:i w:val="1"/>
+                <w:iCs w:val="1"/>
+                <w:sz w:val="18"/>
+                <w:szCs w:val="18"/>
+              </w:rPr>
+              <w:t xml:space="preserve">GET /practicas/{id}/historial</w:t>
+            </w:r>
+          </w:p>
+        </w:tc>
+        <w:tc>
+          <w:tcPr>
+            <w:vAlign w:val="center"/>
+          </w:tcPr>
+          <w:p>
+            <w:pPr>
+              <w:spacing w:after="30" w:before="30" w:lineRule="auto"/>
+              <w:rPr/>
+            </w:pPr>
+            <w:r>
+              <w:rPr>
+                <w:rFonts w:ascii="Calibri" w:cs="Calibri" w:eastAsia="Calibri" w:hAnsi="Calibri"/>
+                <w:i w:val="1"/>
+                <w:iCs w:val="1"/>
+                <w:sz w:val="18"/>
+                <w:szCs w:val="18"/>
+              </w:rPr>
+              <w:t xml:space="preserve">historial_estado · estado_practica · usuario</w:t>
             </w:r>
           </w:p>
         </w:tc>
@@ -3802,7 +4503,27 @@
         <w:rPr>
           <w:rtl w:val="0"/>
         </w:rPr>
-        <w:t xml:space="preserve">El diagrama muestra los actores que interactúan con PracticaLink y las funcionalidades disponibles en el Release 1.1. Cada caso de uso indica entre paréntesis la historia de usuario que lo origina.</w:t>
+        <w:t xml:space="preserve">Los casos de uso se presentan de forma incremental, con un diagrama por épica, siguiendo el orden de la Carta Gantt hasta la semana 9: EP01 (semanas 5 y 6), EP02 (semanas 6 y 7), EP03 (semanas 7 y 8) y EP04 (semanas 8 y 9). En cada diagrama, los casos agregados en ese incremento se muestran en azul y en negrita, y los de incrementos anteriores en gris. Cada caso conserva su posición en todos los diagramas, por lo que se aprecia cómo crece el sistema épica a épica. El último diagrama (Figura 1.4) corresponde a la vista completa de EP01 a EP04. Cada caso de uso indica entre paréntesis la historia de usuario que lo origina.</w:t>
+      </w:r>
+    </w:p>
+    <w:p>
+      <w:pPr>
+        <w:jc w:val="both"/>
+        <w:rPr/>
+      </w:pPr>
+      <w:r>
+        <w:rPr>
+          <w:b w:val="1"/>
+          <w:bCs w:val="1"/>
+          <w:rtl w:val="0"/>
+        </w:rPr>
+        <w:t xml:space="preserve">Incremento 1 — EP01 Acceso y gestión de usuarios (semanas 5 y 6). </w:t>
+      </w:r>
+      <w:r>
+        <w:rPr>
+          <w:rtl w:val="0"/>
+        </w:rPr>
+        <w:t xml:space="preserve">Incorpora el inicio y cierre de sesión y el acceso según el rol, junto con el registro de estudiantes y la gestión de usuarios y roles del administrador, implementados como funcionalidades de apoyo.</w:t>
       </w:r>
     </w:p>
     <w:p>
@@ -3816,14 +4537,278 @@
         <w:rPr/>
         <w:drawing>
           <wp:inline distB="0" distT="0" distL="0" distR="0">
-            <wp:extent cx="5698905" cy="3486830"/>
+            <wp:extent cx="5760720" cy="4320540"/>
             <wp:effectExtent b="0" l="0" r="0" t="0"/>
-            <wp:docPr descr="Diagrama de casos de uso del Release 1.1 (EP01, EP02 y EP03)." id="1246869439" name="image4.png"/>
+            <wp:docPr descr="Casos de uso del incremento 1 (EP01)." id="1246869500" name="image91.png"/>
             <a:graphic>
               <a:graphicData uri="http://schemas.openxmlformats.org/drawingml/2006/picture">
                 <pic:pic>
                   <pic:nvPicPr>
-                    <pic:cNvPr descr="Diagrama de casos de uso del Release 1.1 (EP01, EP02 y EP03)." id="0" name="image4.png"/>
+                    <pic:cNvPr descr="Casos de uso del incremento 1 (EP01)." id="0" name="image91.png"/>
+                    <pic:cNvPicPr preferRelativeResize="0"/>
+                  </pic:nvPicPr>
+                  <pic:blipFill>
+                    <a:blip r:embed="rId91"/>
+                    <a:srcRect b="0" l="0" r="0" t="0"/>
+                    <a:stretch>
+                      <a:fillRect/>
+                    </a:stretch>
+                  </pic:blipFill>
+                  <pic:spPr>
+                    <a:xfrm>
+                      <a:off x="0" y="0"/>
+                      <a:ext cx="5760720" cy="4320540"/>
+                    </a:xfrm>
+                    <a:prstGeom prst="rect"/>
+                    <a:ln/>
+                  </pic:spPr>
+                </pic:pic>
+              </a:graphicData>
+            </a:graphic>
+          </wp:inline>
+        </w:drawing>
+      </w:r>
+    </w:p>
+    <w:p>
+      <w:pPr>
+        <w:spacing w:after="240" w:lineRule="auto"/>
+        <w:jc w:val="center"/>
+        <w:rPr/>
+      </w:pPr>
+      <w:r>
+        <w:rPr>
+          <w:b w:val="1"/>
+          <w:bCs w:val="1"/>
+          <w:i w:val="1"/>
+          <w:iCs w:val="1"/>
+          <w:rtl w:val="0"/>
+        </w:rPr>
+        <w:t xml:space="preserve">Figura 1.1. </w:t>
+      </w:r>
+      <w:r>
+        <w:rPr>
+          <w:i w:val="1"/>
+          <w:iCs w:val="1"/>
+          <w:rtl w:val="0"/>
+        </w:rPr>
+        <w:t xml:space="preserve">Casos de uso del incremento 1 (EP01).</w:t>
+      </w:r>
+    </w:p>
+    <w:p>
+      <w:pPr>
+        <w:jc w:val="both"/>
+        <w:rPr/>
+      </w:pPr>
+      <w:r>
+        <w:rPr>
+          <w:b w:val="1"/>
+          <w:bCs w:val="1"/>
+          <w:rtl w:val="0"/>
+        </w:rPr>
+        <w:t xml:space="preserve">Incremento 2 — EP02 Registro de práctica profesional (semanas 6 y 7). </w:t>
+      </w:r>
+      <w:r>
+        <w:rPr>
+          <w:rtl w:val="0"/>
+        </w:rPr>
+        <w:t xml:space="preserve">El estudiante completa su perfil, registra los antecedentes de su práctica, con validación de la información obligatoria y búsqueda opcional de la empresa por RUT en la API externa, y consulta la práctica registrada. En este incremento se incorpora el actor API Chile RUT Empresa.</w:t>
+      </w:r>
+    </w:p>
+    <w:p>
+      <w:pPr>
+        <w:keepNext w:val="1"/>
+        <w:spacing w:after="60" w:before="120" w:lineRule="auto"/>
+        <w:jc w:val="center"/>
+        <w:rPr/>
+      </w:pPr>
+      <w:r>
+        <w:rPr/>
+        <w:drawing>
+          <wp:inline distB="0" distT="0" distL="0" distR="0">
+            <wp:extent cx="5760720" cy="4320540"/>
+            <wp:effectExtent b="0" l="0" r="0" t="0"/>
+            <wp:docPr descr="Casos de uso del incremento 2 (EP01 y EP02)." id="1246869501" name="image92.png"/>
+            <a:graphic>
+              <a:graphicData uri="http://schemas.openxmlformats.org/drawingml/2006/picture">
+                <pic:pic>
+                  <pic:nvPicPr>
+                    <pic:cNvPr descr="Casos de uso del incremento 2 (EP01 y EP02)." id="0" name="image92.png"/>
+                    <pic:cNvPicPr preferRelativeResize="0"/>
+                  </pic:nvPicPr>
+                  <pic:blipFill>
+                    <a:blip r:embed="rId92"/>
+                    <a:srcRect b="0" l="0" r="0" t="0"/>
+                    <a:stretch>
+                      <a:fillRect/>
+                    </a:stretch>
+                  </pic:blipFill>
+                  <pic:spPr>
+                    <a:xfrm>
+                      <a:off x="0" y="0"/>
+                      <a:ext cx="5760720" cy="4320540"/>
+                    </a:xfrm>
+                    <a:prstGeom prst="rect"/>
+                    <a:ln/>
+                  </pic:spPr>
+                </pic:pic>
+              </a:graphicData>
+            </a:graphic>
+          </wp:inline>
+        </w:drawing>
+      </w:r>
+    </w:p>
+    <w:p>
+      <w:pPr>
+        <w:spacing w:after="240" w:lineRule="auto"/>
+        <w:jc w:val="center"/>
+        <w:rPr/>
+      </w:pPr>
+      <w:r>
+        <w:rPr>
+          <w:b w:val="1"/>
+          <w:bCs w:val="1"/>
+          <w:i w:val="1"/>
+          <w:iCs w:val="1"/>
+          <w:rtl w:val="0"/>
+        </w:rPr>
+        <w:t xml:space="preserve">Figura 1.2. </w:t>
+      </w:r>
+      <w:r>
+        <w:rPr>
+          <w:i w:val="1"/>
+          <w:iCs w:val="1"/>
+          <w:rtl w:val="0"/>
+        </w:rPr>
+        <w:t xml:space="preserve">Casos de uso del incremento 2 (EP01 y EP02).</w:t>
+      </w:r>
+    </w:p>
+    <w:p>
+      <w:pPr>
+        <w:jc w:val="both"/>
+        <w:rPr/>
+      </w:pPr>
+      <w:r>
+        <w:rPr>
+          <w:b w:val="1"/>
+          <w:bCs w:val="1"/>
+          <w:rtl w:val="0"/>
+        </w:rPr>
+        <w:t xml:space="preserve">Incremento 3 — EP03 Revisión y validación de prácticas (semanas 7 y 8). </w:t>
+      </w:r>
+      <w:r>
+        <w:rPr>
+          <w:rtl w:val="0"/>
+        </w:rPr>
+        <w:t xml:space="preserve">Se incorporan los casos del gestor de prácticas: visualizar las solicitudes registradas, consultar sus antecedentes y resolverlas (aprobar, observar o rechazar).</w:t>
+      </w:r>
+    </w:p>
+    <w:p>
+      <w:pPr>
+        <w:keepNext w:val="1"/>
+        <w:spacing w:after="60" w:before="120" w:lineRule="auto"/>
+        <w:jc w:val="center"/>
+        <w:rPr/>
+      </w:pPr>
+      <w:r>
+        <w:rPr/>
+        <w:drawing>
+          <wp:inline distB="0" distT="0" distL="0" distR="0">
+            <wp:extent cx="5760720" cy="4320540"/>
+            <wp:effectExtent b="0" l="0" r="0" t="0"/>
+            <wp:docPr descr="Casos de uso del incremento 3 (EP01 a EP03)." id="1246869502" name="image93.png"/>
+            <a:graphic>
+              <a:graphicData uri="http://schemas.openxmlformats.org/drawingml/2006/picture">
+                <pic:pic>
+                  <pic:nvPicPr>
+                    <pic:cNvPr descr="Casos de uso del incremento 3 (EP01 a EP03)." id="0" name="image93.png"/>
+                    <pic:cNvPicPr preferRelativeResize="0"/>
+                  </pic:nvPicPr>
+                  <pic:blipFill>
+                    <a:blip r:embed="rId93"/>
+                    <a:srcRect b="0" l="0" r="0" t="0"/>
+                    <a:stretch>
+                      <a:fillRect/>
+                    </a:stretch>
+                  </pic:blipFill>
+                  <pic:spPr>
+                    <a:xfrm>
+                      <a:off x="0" y="0"/>
+                      <a:ext cx="5760720" cy="4320540"/>
+                    </a:xfrm>
+                    <a:prstGeom prst="rect"/>
+                    <a:ln/>
+                  </pic:spPr>
+                </pic:pic>
+              </a:graphicData>
+            </a:graphic>
+          </wp:inline>
+        </w:drawing>
+      </w:r>
+    </w:p>
+    <w:p>
+      <w:pPr>
+        <w:spacing w:after="240" w:lineRule="auto"/>
+        <w:jc w:val="center"/>
+        <w:rPr/>
+      </w:pPr>
+      <w:r>
+        <w:rPr>
+          <w:b w:val="1"/>
+          <w:bCs w:val="1"/>
+          <w:i w:val="1"/>
+          <w:iCs w:val="1"/>
+          <w:rtl w:val="0"/>
+        </w:rPr>
+        <w:t xml:space="preserve">Figura 1.3. </w:t>
+      </w:r>
+      <w:r>
+        <w:rPr>
+          <w:i w:val="1"/>
+          <w:iCs w:val="1"/>
+          <w:rtl w:val="0"/>
+        </w:rPr>
+        <w:t xml:space="preserve">Casos de uso del incremento 3 (EP01 a EP03).</w:t>
+      </w:r>
+    </w:p>
+    <w:p>
+      <w:pPr>
+        <w:jc w:val="both"/>
+        <w:rPr/>
+      </w:pPr>
+      <w:r>
+        <w:rPr>
+          <w:b w:val="1"/>
+          <w:bCs w:val="1"/>
+          <w:rtl w:val="0"/>
+        </w:rPr>
+        <w:t xml:space="preserve">Incremento 4 — EP04 Gestión de estado de práctica profesional (semanas 8 y 9). </w:t>
+      </w:r>
+      <w:r>
+        <w:rPr>
+          <w:rtl w:val="0"/>
+        </w:rPr>
+        <w:t xml:space="preserve">El estudiante y el gestor pueden consultar el estado actual de una práctica y su historial de estados, y el gestor puede actualizar el estado. Este diagrama es la vista completa del sistema hasta la semana 9.</w:t>
+      </w:r>
+    </w:p>
+    <w:p>
+      <w:pPr>
+        <w:keepNext w:val="1"/>
+        <w:spacing w:after="60" w:before="120" w:lineRule="auto"/>
+        <w:jc w:val="center"/>
+        <w:rPr/>
+      </w:pPr>
+      <w:r>
+        <w:rPr/>
+        <w:drawing>
+          <wp:inline distB="0" distT="0" distL="0" distR="0">
+            <wp:extent cx="5760720" cy="4320540"/>
+            <wp:effectExtent b="0" l="0" r="0" t="0"/>
+            <wp:docPr descr="Casos de uso del incremento 4: vista completa de EP01 a EP04 (hasta la semana 9)." id="1246869503" name="image4.png"/>
+            <a:graphic>
+              <a:graphicData uri="http://schemas.openxmlformats.org/drawingml/2006/picture">
+                <pic:pic>
+                  <pic:nvPicPr>
+                    <pic:cNvPr descr="Casos de uso del incremento 4: vista completa de EP01 a EP04 (hasta la semana 9)." id="0" name="image4.png"/>
                     <pic:cNvPicPr preferRelativeResize="0"/>
                   </pic:nvPicPr>
                   <pic:blipFill>
@@ -3836,7 +4821,7 @@
                   <pic:spPr>
                     <a:xfrm>
                       <a:off x="0" y="0"/>
-                      <a:ext cx="5698905" cy="3486830"/>
+                      <a:ext cx="5760720" cy="4320540"/>
                     </a:xfrm>
                     <a:prstGeom prst="rect"/>
                     <a:ln/>
@@ -3847,11 +4832,6 @@
           </wp:inline>
         </w:drawing>
       </w:r>
-      <w:r>
-        <w:rPr>
-          <w:rtl w:val="0"/>
-        </w:rPr>
-      </w:r>
     </w:p>
     <w:p>
       <w:pPr>
@@ -3867,7 +4847,7 @@
           <w:iCs w:val="1"/>
           <w:rtl w:val="0"/>
         </w:rPr>
-        <w:t xml:space="preserve">Figura 1. </w:t>
+        <w:t xml:space="preserve">Figura 1.4. </w:t>
       </w:r>
       <w:r>
         <w:rPr>
@@ -3875,12 +4855,7 @@
           <w:iCs w:val="1"/>
           <w:rtl w:val="0"/>
         </w:rPr>
-        <w:t xml:space="preserve">Diagrama de casos de uso del Release 1.1 (EP01, EP02 y EP03).</w:t>
-      </w:r>
-      <w:r>
-        <w:rPr>
-          <w:rtl w:val="0"/>
-        </w:rPr>
+        <w:t xml:space="preserve">Casos de uso del incremento 4: vista completa de EP01 a EP04 (hasta la semana 9).</w:t>
       </w:r>
     </w:p>
     <w:p>
@@ -3906,7 +4881,7 @@
         <w:rPr>
           <w:rtl w:val="0"/>
         </w:rPr>
-        <w:t xml:space="preserve">se registra, completa su perfil (RUT, carrera y sede), registra los antecedentes de su práctica y consulta su estado.</w:t>
+        <w:t xml:space="preserve">se registra, completa su perfil (RUT, carrera y sede), registra los antecedentes de su práctica, la consulta y revisa su estado actual y el historial de cambios de estado.</w:t>
       </w:r>
     </w:p>
     <w:p>
@@ -3932,7 +4907,7 @@
         <w:rPr>
           <w:rtl w:val="0"/>
         </w:rPr>
-        <w:t xml:space="preserve">visualiza las solicitudes registradas, consulta sus antecedentes y las aprueba, observa o rechaza.</w:t>
+        <w:t xml:space="preserve">visualiza las solicitudes registradas, consulta sus antecedentes y las aprueba, observa o rechaza. Además, consulta y actualiza el estado de las prácticas y revisa su historial de estados.</w:t>
       </w:r>
     </w:p>
     <w:p>
@@ -3996,7 +4971,7 @@
         <w:rPr>
           <w:rtl w:val="0"/>
         </w:rPr>
-        <w:t xml:space="preserve">La relación «include» indica un comportamiento que siempre forma parte del caso base: al iniciar sesión siempre se identifica el rol del usuario, al registrar una práctica siempre se valida la información obligatoria y al resolver una solicitud siempre se consultan sus antecedentes. La relación «extend» indica un comportamiento opcional: el estudiante puede buscar la empresa por RUT para completar automáticamente los datos del centro de práctica. Los casos "Registrarse en el sistema", "Completar perfil de estudiante" y "Gestionar usuarios y roles" son funcionalidades de apoyo implementadas en el mismo release.</w:t>
+        <w:t xml:space="preserve">La relación «include» indica un comportamiento que siempre forma parte del caso base: al iniciar sesión siempre se identifica el rol del usuario, al registrar una práctica siempre se valida la información obligatoria, al resolver una solicitud siempre se consultan sus antecedentes y al actualizar el estado de una práctica siempre se consulta su estado actual. La relación «extend» indica un comportamiento opcional: el estudiante puede buscar la empresa por RUT para completar automáticamente los datos del centro de práctica. Los casos "Registrarse en el sistema", "Completar perfil de estudiante" y "Gestionar usuarios y roles" son funcionalidades de apoyo implementadas en el Release 1.1. Los casos de EP04 (HU04.1 a HU04.3) corresponden a las historias 010 a 012 del Product Backlog; cada cambio de estado queda registrado en la tabla historial_estado, lo que permite consultar la trazabilidad del proceso.</w:t>
       </w:r>
     </w:p>
     <w:p>
@@ -4041,12 +5016,19 @@
       <w:pPr>
         <w:jc w:val="both"/>
         <w:rPr/>
-      </w:pPr>
-      <w:r>
-        <w:rPr>
-          <w:rtl w:val="0"/>
-        </w:rPr>
-        <w:t xml:space="preserve">El modelo entidad-relación incluye las nueve tablas que utilizan las historias terminadas. La base de datos es PostgreSQL, alojada en Supabase.</w:t>
+        <w:sectPr>
+          <w:headerReference r:id="rId18" w:type="default"/>
+          <w:footerReference r:id="rId19" w:type="default"/>
+          <w:type w:val="nextPage"/>
+          <w:pgSz w:h="15840" w:w="12240" w:orient="portrait"/>
+          <w:pgMar w:bottom="1300" w:top="1300" w:left="1300" w:right="1300" w:header="708" w:footer="708"/>
+        </w:sectPr>
+      </w:pPr>
+      <w:r>
+        <w:rPr>
+          <w:rtl w:val="0"/>
+        </w:rPr>
+        <w:t xml:space="preserve">El modelo entidad-relación presenta el esquema completo de la base de datos de PracticaLink: quince tablas, que incluyen tanto las utilizadas por las historias terminadas como las que soportarán las épicas EP04 a EP07. La base de datos es PostgreSQL, alojada en Supabase, y el modelo corresponde al script scripts/BD/schema.sql del repositorio. En la página siguiente se muestra el diagrama en orientación horizontal para facilitar su lectura.</w:t>
       </w:r>
     </w:p>
     <w:p>
@@ -4060,14 +5042,14 @@
         <w:rPr/>
         <w:drawing>
           <wp:inline distB="0" distT="0" distL="0" distR="0">
-            <wp:extent cx="6553023" cy="4871633"/>
+            <wp:extent cx="8549640" cy="5736366"/>
             <wp:effectExtent b="0" l="0" r="0" t="0"/>
-            <wp:docPr descr="Modelo entidad-relación de las tablas utilizadas por EP01, EP02 y EP03." id="1246869441" name="image2.png"/>
+            <wp:docPr descr="Modelo entidad-relación completo de PracticaLink." id="1246869441" name="image2.png"/>
             <a:graphic>
               <a:graphicData uri="http://schemas.openxmlformats.org/drawingml/2006/picture">
                 <pic:pic>
                   <pic:nvPicPr>
-                    <pic:cNvPr descr="Modelo entidad-relación de las tablas utilizadas por EP01, EP02 y EP03." id="0" name="image2.png"/>
+                    <pic:cNvPr descr="Modelo entidad-relación completo de PracticaLink." id="0" name="image2.png"/>
                     <pic:cNvPicPr preferRelativeResize="0"/>
                   </pic:nvPicPr>
                   <pic:blipFill>
@@ -4080,7 +5062,7 @@
                   <pic:spPr>
                     <a:xfrm>
                       <a:off x="0" y="0"/>
-                      <a:ext cx="6553023" cy="4871633"/>
+                      <a:ext cx="8549640" cy="5736366"/>
                     </a:xfrm>
                     <a:prstGeom prst="rect"/>
                     <a:ln/>
@@ -4091,17 +5073,19 @@
           </wp:inline>
         </w:drawing>
       </w:r>
-      <w:r>
-        <w:rPr>
-          <w:rtl w:val="0"/>
-        </w:rPr>
-      </w:r>
     </w:p>
     <w:p>
       <w:pPr>
         <w:spacing w:after="240" w:lineRule="auto"/>
         <w:jc w:val="center"/>
         <w:rPr/>
+        <w:sectPr>
+          <w:headerReference r:id="rId18" w:type="default"/>
+          <w:footerReference r:id="rId19" w:type="default"/>
+          <w:type w:val="nextPage"/>
+          <w:pgSz w:h="12240" w:w="15840" w:orient="landscape"/>
+          <w:pgMar w:bottom="1000" w:top="1000" w:left="1100" w:right="1100" w:header="500" w:footer="500"/>
+        </w:sectPr>
       </w:pPr>
       <w:r>
         <w:rPr>
@@ -4119,12 +5103,7 @@
           <w:iCs w:val="1"/>
           <w:rtl w:val="0"/>
         </w:rPr>
-        <w:t xml:space="preserve">Modelo entidad-relación de las tablas utilizadas por EP01, EP02 y EP03.</w:t>
-      </w:r>
-      <w:r>
-        <w:rPr>
-          <w:rtl w:val="0"/>
-        </w:rPr>
+        <w:t xml:space="preserve">Modelo entidad-relación completo de PracticaLink (15 tablas).</w:t>
       </w:r>
     </w:p>
     <w:p>
@@ -4202,7 +5181,7 @@
         <w:rPr>
           <w:rtl w:val="0"/>
         </w:rPr>
-        <w:t xml:space="preserve">registra los antecedentes de la práctica y se relaciona con el estudiante, el centro de práctica y su estado actual.</w:t>
+        <w:t xml:space="preserve">registra los antecedentes de la práctica y se relaciona con el estudiante, el centro de práctica y su estado actual. Es la entidad central del modelo: de ella dependen el historial de estados, los seguimientos, las incidencias, los documentos y el cierre.</w:t>
       </w:r>
     </w:p>
     <w:p>
@@ -4274,6 +5253,32 @@
           <w:bCs w:val="1"/>
           <w:rtl w:val="0"/>
         </w:rPr>
+        <w:t xml:space="preserve">centro_practica: </w:t>
+      </w:r>
+      <w:r>
+        <w:rPr>
+          <w:rtl w:val="0"/>
+        </w:rPr>
+        <w:t xml:space="preserve">empresa o institución donde se realiza la práctica, con sus datos de contacto. Un centro puede recibir varias prácticas.</w:t>
+      </w:r>
+    </w:p>
+    <w:p>
+      <w:pPr>
+        <w:numPr>
+          <w:ilvl w:val="0"/>
+          <w:numId w:val="2"/>
+        </w:numPr>
+        <w:spacing w:after="60" w:lineRule="auto"/>
+        <w:ind w:left="720" w:hanging="360"/>
+        <w:jc w:val="both"/>
+        <w:rPr/>
+      </w:pPr>
+      <w:r>
+        <w:rPr>
+          <w:b w:val="1"/>
+          <w:bCs w:val="1"/>
+          <w:rtl w:val="0"/>
+        </w:rPr>
         <w:t xml:space="preserve">empresa: </w:t>
       </w:r>
       <w:r>
@@ -4285,14 +5290,118 @@
     </w:p>
     <w:p>
       <w:pPr>
+        <w:numPr>
+          <w:ilvl w:val="0"/>
+          <w:numId w:val="2"/>
+        </w:numPr>
+        <w:spacing w:after="60" w:lineRule="auto"/>
+        <w:ind w:left="720" w:hanging="360"/>
         <w:jc w:val="both"/>
         <w:rPr/>
       </w:pPr>
       <w:r>
         <w:rPr>
-          <w:rtl w:val="0"/>
-        </w:rPr>
-        <w:t xml:space="preserve">El esquema también contiene las tablas seguimiento, incidencia, alerta, documento, tipo_documento y cierre_practica, que se usarán en las épicas EP04 a EP07 y por eso no se incluyen en este diagrama.</w:t>
+          <w:b w:val="1"/>
+          <w:bCs w:val="1"/>
+          <w:rtl w:val="0"/>
+        </w:rPr>
+        <w:t xml:space="preserve">seguimiento: </w:t>
+      </w:r>
+      <w:r>
+        <w:rPr>
+          <w:rtl w:val="0"/>
+        </w:rPr>
+        <w:t xml:space="preserve">registros de seguimiento de una práctica, con fecha, tipo y observación, realizados por un usuario (historias 013 y 014).</w:t>
+      </w:r>
+    </w:p>
+    <w:p>
+      <w:pPr>
+        <w:numPr>
+          <w:ilvl w:val="0"/>
+          <w:numId w:val="2"/>
+        </w:numPr>
+        <w:spacing w:after="60" w:lineRule="auto"/>
+        <w:ind w:left="720" w:hanging="360"/>
+        <w:jc w:val="both"/>
+        <w:rPr/>
+      </w:pPr>
+      <w:r>
+        <w:rPr>
+          <w:b w:val="1"/>
+          <w:bCs w:val="1"/>
+          <w:rtl w:val="0"/>
+        </w:rPr>
+        <w:t xml:space="preserve">incidencia y alerta: </w:t>
+      </w:r>
+      <w:r>
+        <w:rPr>
+          <w:rtl w:val="0"/>
+        </w:rPr>
+        <w:t xml:space="preserve">una incidencia describe una situación ocurrida durante la práctica, con prioridad (BAJA, MEDIA, ALTA o CRITICA) y estado (ABIERTA, EN_REVISION, RESUELTA o CERRADA). Cada incidencia puede generar alertas, cuyo estado es PENDIENTE, LEIDA o CERRADA (historias 015 a 017).</w:t>
+      </w:r>
+    </w:p>
+    <w:p>
+      <w:pPr>
+        <w:numPr>
+          <w:ilvl w:val="0"/>
+          <w:numId w:val="2"/>
+        </w:numPr>
+        <w:spacing w:after="60" w:lineRule="auto"/>
+        <w:ind w:left="720" w:hanging="360"/>
+        <w:jc w:val="both"/>
+        <w:rPr/>
+      </w:pPr>
+      <w:r>
+        <w:rPr>
+          <w:b w:val="1"/>
+          <w:bCs w:val="1"/>
+          <w:rtl w:val="0"/>
+        </w:rPr>
+        <w:t xml:space="preserve">documento y tipo_documento: </w:t>
+      </w:r>
+      <w:r>
+        <w:rPr>
+          <w:rtl w:val="0"/>
+        </w:rPr>
+        <w:t xml:space="preserve">archivos asociados a una práctica, con su nombre original, nombre almacenado, ruta, tipo MIME y tamaño, y el usuario que los subió. El catálogo tipo_documento los clasifica en CONTRATO, FORMULARIO, CARTA, SEGUIMIENTO, CIERRE u OTRO.</w:t>
+      </w:r>
+    </w:p>
+    <w:p>
+      <w:pPr>
+        <w:numPr>
+          <w:ilvl w:val="0"/>
+          <w:numId w:val="2"/>
+        </w:numPr>
+        <w:spacing w:after="60" w:lineRule="auto"/>
+        <w:ind w:left="720" w:hanging="360"/>
+        <w:jc w:val="both"/>
+        <w:rPr/>
+      </w:pPr>
+      <w:r>
+        <w:rPr>
+          <w:b w:val="1"/>
+          <w:bCs w:val="1"/>
+          <w:rtl w:val="0"/>
+        </w:rPr>
+        <w:t xml:space="preserve">cierre_practica: </w:t>
+      </w:r>
+      <w:r>
+        <w:rPr>
+          <w:rtl w:val="0"/>
+        </w:rPr>
+        <w:t xml:space="preserve">registro del cierre de una práctica, con relación uno a uno con practica (id_practica es único), el resultado (APROBADA, REPROBADA o ANULADA), la fecha, una observación y el usuario que lo registra (historias 018 y 019).</w:t>
+      </w:r>
+    </w:p>
+    <w:p>
+      <w:pPr>
+        <w:jc w:val="both"/>
+        <w:rPr/>
+      </w:pPr>
+      <w:r>
+        <w:rPr>
+          <w:rtl w:val="0"/>
+        </w:rPr>
+        <w:t xml:space="preserve">Las tablas usuario, rol, usuario_rol, estudiante, centro_practica, empresa, estado_practica, practica e historial_estado están en uso en el Release 1.1. Las tablas seguimiento, incidencia, alerta, documento, tipo_documento y cierre_practica ya existen en el esquema y se utilizarán en las épicas EP04 a EP07. Todas las tablas usan claves primarias BIGINT generadas por identidad, y las reglas de negocio básicas se aseguran con restricciones CHECK (fechas y horas de la práctica, prioridad y estado de incidencias, estado de alertas, tamaño de documentos y resultado del cierre).</w:t>
       </w:r>
     </w:p>
     <w:p>
@@ -5488,7 +6597,260 @@
         <w:rPr>
           <w:rtl w:val="0"/>
         </w:rPr>
-        <w:t xml:space="preserve">En el estado actual del proyecto, el frontend y el backend se ejecutan en un entorno local de desarrollo (localhost:4200 y 127.0.0.1:8000), mientras que la base de datos se encuentra en Supabase.</w:t>
+        <w:t xml:space="preserve">El diagrama de componentes describe cómo se organiza el software. La distribución física de esos componentes en nodos de hardware y entornos de ejecución se presenta en el diagrama de despliegue.</w:t>
+      </w:r>
+    </w:p>
+    <w:p>
+      <w:pPr>
+        <w:pStyle w:val="Heading3"/>
+        <w:numPr>
+          <w:ilvl w:val="2"/>
+          <w:numId w:val="1"/>
+        </w:numPr>
+        <w:ind w:left="720" w:hanging="720"/>
+        <w:rPr/>
+      </w:pPr>
+      <w:bookmarkStart w:colFirst="0" w:colLast="0" w:name="_heading=h.despliegue432" w:id="90"/>
+      <w:bookmarkEnd w:id="90"/>
+      <w:r>
+        <w:rPr>
+          <w:rtl w:val="0"/>
+        </w:rPr>
+        <w:t xml:space="preserve">Diagrama de Despliegue</w:t>
+      </w:r>
+    </w:p>
+    <w:p>
+      <w:pPr>
+        <w:jc w:val="both"/>
+        <w:rPr/>
+      </w:pPr>
+      <w:r>
+        <w:rPr>
+          <w:rtl w:val="0"/>
+        </w:rPr>
+        <w:t xml:space="preserve">El diagrama de despliegue muestra la infraestructura del entorno de QA del Release 1.1: la aplicación móvil instalada en un teléfono Android, el backend publicado en Render, la base de datos en Supabase y el servicio externo Chile RUT Empresa. También incluye el repositorio GitHub, desde el que se despliega el backend, y el equipo de desarrollo, donde se compila la APK.</w:t>
+      </w:r>
+    </w:p>
+    <w:p>
+      <w:pPr>
+        <w:keepNext w:val="1"/>
+        <w:spacing w:after="60" w:before="120" w:lineRule="auto"/>
+        <w:jc w:val="center"/>
+        <w:rPr/>
+      </w:pPr>
+      <w:r>
+        <w:rPr/>
+        <w:drawing>
+          <wp:inline distB="0" distT="0" distL="0" distR="0">
+            <wp:extent cx="5669280" cy="6518252"/>
+            <wp:effectExtent b="0" l="0" r="0" t="0"/>
+            <wp:docPr descr="Diagrama de despliegue del entorno QA de PracticaLink." id="1246869490" name="despliegue.png"/>
+            <a:graphic>
+              <a:graphicData uri="http://schemas.openxmlformats.org/drawingml/2006/picture">
+                <pic:pic>
+                  <pic:nvPicPr>
+                    <pic:cNvPr descr="Diagrama de despliegue del entorno QA de PracticaLink." id="0" name="despliegue.png"/>
+                    <pic:cNvPicPr preferRelativeResize="0"/>
+                  </pic:nvPicPr>
+                  <pic:blipFill>
+                    <a:blip r:embed="rId90"/>
+                    <a:srcRect b="0" l="0" r="0" t="0"/>
+                    <a:stretch>
+                      <a:fillRect/>
+                    </a:stretch>
+                  </pic:blipFill>
+                  <pic:spPr>
+                    <a:xfrm>
+                      <a:off x="0" y="0"/>
+                      <a:ext cx="5669280" cy="6518252"/>
+                    </a:xfrm>
+                    <a:prstGeom prst="rect"/>
+                    <a:ln/>
+                  </pic:spPr>
+                </pic:pic>
+              </a:graphicData>
+            </a:graphic>
+          </wp:inline>
+        </w:drawing>
+      </w:r>
+    </w:p>
+    <w:p>
+      <w:pPr>
+        <w:spacing w:after="240" w:lineRule="auto"/>
+        <w:jc w:val="center"/>
+        <w:rPr/>
+      </w:pPr>
+      <w:r>
+        <w:rPr>
+          <w:b w:val="1"/>
+          <w:bCs w:val="1"/>
+          <w:i w:val="1"/>
+          <w:iCs w:val="1"/>
+          <w:rtl w:val="0"/>
+        </w:rPr>
+        <w:t xml:space="preserve">Figura 9. </w:t>
+      </w:r>
+      <w:r>
+        <w:rPr>
+          <w:i w:val="1"/>
+          <w:iCs w:val="1"/>
+          <w:rtl w:val="0"/>
+        </w:rPr>
+        <w:t xml:space="preserve">Diagrama de despliegue del entorno QA de PracticaLink.</w:t>
+      </w:r>
+    </w:p>
+    <w:p>
+      <w:pPr>
+        <w:numPr>
+          <w:ilvl w:val="0"/>
+          <w:numId w:val="2"/>
+        </w:numPr>
+        <w:spacing w:after="60" w:lineRule="auto"/>
+        <w:ind w:left="720" w:hanging="360"/>
+        <w:jc w:val="both"/>
+        <w:rPr/>
+      </w:pPr>
+      <w:r>
+        <w:rPr>
+          <w:b w:val="1"/>
+          <w:bCs w:val="1"/>
+          <w:rtl w:val="0"/>
+        </w:rPr>
+        <w:t xml:space="preserve">Teléfono Android: </w:t>
+      </w:r>
+      <w:r>
+        <w:rPr>
+          <w:rtl w:val="0"/>
+        </w:rPr>
+        <w:t xml:space="preserve">ejecuta la aplicación PracticaLink (cl.practicalink.app, versión 1.1.1), compatible con Android 7.0 (API 24) o superior y compilada para la API 36. La APK se genera con Capacitor, que empaqueta el mismo frontend Angular 20 + Ionic 9 y lo ejecuta en un WebView. Solo requiere el permiso de acceso a Internet.</w:t>
+      </w:r>
+    </w:p>
+    <w:p>
+      <w:pPr>
+        <w:numPr>
+          <w:ilvl w:val="0"/>
+          <w:numId w:val="2"/>
+        </w:numPr>
+        <w:spacing w:after="60" w:lineRule="auto"/>
+        <w:ind w:left="720" w:hanging="360"/>
+        <w:jc w:val="both"/>
+        <w:rPr/>
+      </w:pPr>
+      <w:r>
+        <w:rPr>
+          <w:b w:val="1"/>
+          <w:bCs w:val="1"/>
+          <w:rtl w:val="0"/>
+        </w:rPr>
+        <w:t xml:space="preserve">Render (PaaS): </w:t>
+      </w:r>
+      <w:r>
+        <w:rPr>
+          <w:rtl w:val="0"/>
+        </w:rPr>
+        <w:t xml:space="preserve">aloja el Web Service practicalink-api-qa, que ejecuta el backend FastAPI con Uvicorn (Python 3.12) mediante el comando uvicorn app.main:app --host 0.0.0.0 --port $PORT. Render obtiene el código del directorio PracticaLink/backend del repositorio y lo publica en https://practicalink-api-qa.onrender.com.</w:t>
+      </w:r>
+    </w:p>
+    <w:p>
+      <w:pPr>
+        <w:numPr>
+          <w:ilvl w:val="0"/>
+          <w:numId w:val="2"/>
+        </w:numPr>
+        <w:spacing w:after="60" w:lineRule="auto"/>
+        <w:ind w:left="720" w:hanging="360"/>
+        <w:jc w:val="both"/>
+        <w:rPr/>
+      </w:pPr>
+      <w:r>
+        <w:rPr>
+          <w:b w:val="1"/>
+          <w:bCs w:val="1"/>
+          <w:rtl w:val="0"/>
+        </w:rPr>
+        <w:t xml:space="preserve">Supabase: </w:t>
+      </w:r>
+      <w:r>
+        <w:rPr>
+          <w:rtl w:val="0"/>
+        </w:rPr>
+        <w:t xml:space="preserve">aloja la base de datos PostgreSQL con las 15 tablas y las funciones fn_*. El backend se conecta por el puerto 5432 mediante SQLAlchemy y el driver psycopg, con verificación de la conexión antes de cada uso (pool_pre_ping).</w:t>
+      </w:r>
+    </w:p>
+    <w:p>
+      <w:pPr>
+        <w:numPr>
+          <w:ilvl w:val="0"/>
+          <w:numId w:val="2"/>
+        </w:numPr>
+        <w:spacing w:after="60" w:lineRule="auto"/>
+        <w:ind w:left="720" w:hanging="360"/>
+        <w:jc w:val="both"/>
+        <w:rPr/>
+      </w:pPr>
+      <w:r>
+        <w:rPr>
+          <w:b w:val="1"/>
+          <w:bCs w:val="1"/>
+          <w:rtl w:val="0"/>
+        </w:rPr>
+        <w:t xml:space="preserve">Chile RUT Empresa: </w:t>
+      </w:r>
+      <w:r>
+        <w:rPr>
+          <w:rtl w:val="0"/>
+        </w:rPr>
+        <w:t xml:space="preserve">API externa que el módulo empresas consulta por HTTPS con una clave de API. Las respuestas se guardan en la tabla empresa durante 30 días para reducir las consultas.</w:t>
+      </w:r>
+    </w:p>
+    <w:p>
+      <w:pPr>
+        <w:numPr>
+          <w:ilvl w:val="0"/>
+          <w:numId w:val="2"/>
+        </w:numPr>
+        <w:spacing w:after="60" w:lineRule="auto"/>
+        <w:ind w:left="720" w:hanging="360"/>
+        <w:jc w:val="both"/>
+        <w:rPr/>
+      </w:pPr>
+      <w:r>
+        <w:rPr>
+          <w:b w:val="1"/>
+          <w:bCs w:val="1"/>
+          <w:rtl w:val="0"/>
+        </w:rPr>
+        <w:t xml:space="preserve">GitHub y equipo de desarrollo: </w:t>
+      </w:r>
+      <w:r>
+        <w:rPr>
+          <w:rtl w:val="0"/>
+        </w:rPr>
+        <w:t xml:space="preserve">el repositorio contiene el código del frontend y del backend. Render despliega el backend desde la rama configurada, y en el equipo de desarrollo se compila la APK con el comando npm run build-android:qa y Android Studio.</w:t>
+      </w:r>
+    </w:p>
+    <w:p>
+      <w:pPr>
+        <w:jc w:val="both"/>
+        <w:rPr/>
+      </w:pPr>
+      <w:r>
+        <w:rPr>
+          <w:rtl w:val="0"/>
+        </w:rPr>
+        <w:t xml:space="preserve">Las credenciales (cadena de conexión a Supabase, clave para firmar los JWT y clave de la API externa) se configuran como variables de entorno en Render y no se guardan en el repositorio. El backend solo acepta solicitudes de los orígenes permitidos por CORS, entre ellos capacitor://localhost y https://localhost, que usa la aplicación Android. La instancia gratuita de Render se suspende por inactividad, por lo que la primera solicitud puede tardar cerca de un minuto en responder.</w:t>
+      </w:r>
+    </w:p>
+    <w:p>
+      <w:pPr>
+        <w:jc w:val="both"/>
+        <w:rPr/>
+      </w:pPr>
+      <w:r>
+        <w:rPr>
+          <w:rtl w:val="0"/>
+        </w:rPr>
+        <w:t xml:space="preserve">Además del entorno de QA, el proyecto utiliza un entorno de desarrollo local, en el que el frontend se ejecuta con ng serve (localhost:4200) y el backend con Uvicorn (127.0.0.1:8000), conectado a la misma base de datos en Supabase. La URL del backend se define en los archivos environment de Angular, por lo que el mismo código funciona en ambos entornos sin modificaciones.</w:t>
       </w:r>
     </w:p>
     <w:sectPr>

</xml_diff>